<commit_message>
Change: "Documento de Especificación de Requisitos" -I wasn`t really sure about the original content of the document, so I decided to make another one, quite more complex and detailed. -It`s not completed yet. -I`ll try to keep working on this project, but I`m not making a great progress on it
</commit_message>
<xml_diff>
--- a/Documento de Especificación de Requisitos.docx
+++ b/Documento de Especificación de Requisitos.docx
@@ -19,7 +19,13 @@
         <w:pStyle w:val="Ttulo1"/>
       </w:pPr>
       <w:r>
-        <w:t xml:space="preserve">Materia: </w:t>
+        <w:t>Materia</w:t>
+      </w:r>
+      <w:r>
+        <w:t>s</w:t>
+      </w:r>
+      <w:r>
+        <w:t xml:space="preserve">: </w:t>
       </w:r>
     </w:p>
     <w:p>
@@ -87,7 +93,13 @@
         </w:numPr>
       </w:pPr>
       <w:r>
-        <w:t>Méndez, .</w:t>
+        <w:t>Méndez,</w:t>
+      </w:r>
+      <w:r>
+        <w:t xml:space="preserve"> </w:t>
+      </w:r>
+      <w:r>
+        <w:t>.</w:t>
       </w:r>
     </w:p>
     <w:p>
@@ -107,7 +119,13 @@
         <w:pStyle w:val="Ttulo1"/>
       </w:pPr>
       <w:r>
-        <w:t xml:space="preserve">Integrantes: </w:t>
+        <w:t>Integrante</w:t>
+      </w:r>
+      <w:r>
+        <w:t>s</w:t>
+      </w:r>
+      <w:r>
+        <w:t xml:space="preserve">: </w:t>
       </w:r>
     </w:p>
     <w:p>
@@ -122,9 +140,6 @@
         <w:t>Bustos, Thomas Nicolás.</w:t>
       </w:r>
     </w:p>
-    <w:p/>
-    <w:p/>
-    <w:p/>
     <w:p>
       <w:pPr>
         <w:pStyle w:val="Ttulo1"/>
@@ -142,7 +157,31 @@
         </w:numPr>
       </w:pPr>
       <w:r>
-        <w:t>Resumen Ejecutivo y Objetivos</w:t>
+        <w:t>Introducción</w:t>
+      </w:r>
+    </w:p>
+    <w:p>
+      <w:pPr>
+        <w:pStyle w:val="Prrafodelista"/>
+        <w:numPr>
+          <w:ilvl w:val="1"/>
+          <w:numId w:val="4"/>
+        </w:numPr>
+      </w:pPr>
+      <w:r>
+        <w:t>Objetivo</w:t>
+      </w:r>
+    </w:p>
+    <w:p>
+      <w:pPr>
+        <w:pStyle w:val="Prrafodelista"/>
+        <w:numPr>
+          <w:ilvl w:val="1"/>
+          <w:numId w:val="4"/>
+        </w:numPr>
+      </w:pPr>
+      <w:r>
+        <w:t>Destinatarios</w:t>
       </w:r>
     </w:p>
     <w:p>
@@ -154,7 +193,67 @@
         </w:numPr>
       </w:pPr>
       <w:r>
-        <w:t>Alcance y Entregables</w:t>
+        <w:t>Descripción general</w:t>
+      </w:r>
+    </w:p>
+    <w:p>
+      <w:pPr>
+        <w:pStyle w:val="Prrafodelista"/>
+        <w:numPr>
+          <w:ilvl w:val="1"/>
+          <w:numId w:val="4"/>
+        </w:numPr>
+      </w:pPr>
+      <w:r>
+        <w:t>Necesidades de los usuarios</w:t>
+      </w:r>
+    </w:p>
+    <w:p>
+      <w:pPr>
+        <w:pStyle w:val="Prrafodelista"/>
+        <w:numPr>
+          <w:ilvl w:val="1"/>
+          <w:numId w:val="4"/>
+        </w:numPr>
+      </w:pPr>
+      <w:r>
+        <w:t>Perspectiva del producto</w:t>
+      </w:r>
+    </w:p>
+    <w:p>
+      <w:pPr>
+        <w:pStyle w:val="Prrafodelista"/>
+        <w:numPr>
+          <w:ilvl w:val="2"/>
+          <w:numId w:val="4"/>
+        </w:numPr>
+      </w:pPr>
+      <w:r>
+        <w:t>Interfases de usuario</w:t>
+      </w:r>
+    </w:p>
+    <w:p>
+      <w:pPr>
+        <w:pStyle w:val="Prrafodelista"/>
+        <w:numPr>
+          <w:ilvl w:val="2"/>
+          <w:numId w:val="4"/>
+        </w:numPr>
+      </w:pPr>
+      <w:r>
+        <w:t>Interfases de comunicación con el servidor</w:t>
+      </w:r>
+    </w:p>
+    <w:p>
+      <w:pPr>
+        <w:pStyle w:val="Prrafodelista"/>
+        <w:numPr>
+          <w:ilvl w:val="2"/>
+          <w:numId w:val="4"/>
+        </w:numPr>
+      </w:pPr>
+      <w:r>
+        <w:t>Interfases de comunicación con la base de datos</w:t>
       </w:r>
     </w:p>
     <w:p>
@@ -166,33 +265,567 @@
         </w:numPr>
       </w:pPr>
       <w:r>
-        <w:t>Requerimientos Técnicos y Diseño</w:t>
-      </w:r>
-    </w:p>
-    <w:p>
-      <w:pPr>
-        <w:pStyle w:val="Prrafodelista"/>
+        <w:t>Características y requisitos del sistema</w:t>
+      </w:r>
+    </w:p>
+    <w:p>
+      <w:pPr>
+        <w:pStyle w:val="Prrafodelista"/>
+        <w:numPr>
+          <w:ilvl w:val="1"/>
+          <w:numId w:val="4"/>
+        </w:numPr>
+      </w:pPr>
+      <w:r>
+        <w:t>Requisitos funcionales</w:t>
+      </w:r>
+    </w:p>
+    <w:p>
+      <w:pPr>
+        <w:pStyle w:val="Prrafodelista"/>
+        <w:numPr>
+          <w:ilvl w:val="2"/>
+          <w:numId w:val="4"/>
+        </w:numPr>
+      </w:pPr>
+      <w:r>
+        <w:t>Manejo de usuarios</w:t>
+      </w:r>
+    </w:p>
+    <w:p>
+      <w:pPr>
+        <w:pStyle w:val="Prrafodelista"/>
+        <w:numPr>
+          <w:ilvl w:val="2"/>
+          <w:numId w:val="4"/>
+        </w:numPr>
+      </w:pPr>
+      <w:r>
+        <w:t>Manejo de chats</w:t>
+      </w:r>
+    </w:p>
+    <w:p>
+      <w:pPr>
+        <w:pStyle w:val="Prrafodelista"/>
+        <w:numPr>
+          <w:ilvl w:val="2"/>
+          <w:numId w:val="4"/>
+        </w:numPr>
+      </w:pPr>
+      <w:r>
+        <w:t>Manejo de publicaciones y comentarios</w:t>
+      </w:r>
+    </w:p>
+    <w:p>
+      <w:pPr>
+        <w:pStyle w:val="Prrafodelista"/>
+        <w:numPr>
+          <w:ilvl w:val="2"/>
+          <w:numId w:val="4"/>
+        </w:numPr>
+      </w:pPr>
+      <w:r>
+        <w:t>Manejo de información de usuarios</w:t>
+      </w:r>
+    </w:p>
+    <w:p>
+      <w:pPr>
+        <w:pStyle w:val="Prrafodelista"/>
+        <w:numPr>
+          <w:ilvl w:val="2"/>
+          <w:numId w:val="4"/>
+        </w:numPr>
+      </w:pPr>
+      <w:r>
+        <w:t>Manejo de reportes</w:t>
+      </w:r>
+    </w:p>
+    <w:p>
+      <w:pPr>
+        <w:pStyle w:val="Prrafodelista"/>
+        <w:numPr>
+          <w:ilvl w:val="2"/>
+          <w:numId w:val="4"/>
+        </w:numPr>
+      </w:pPr>
+      <w:r>
+        <w:t>Manejo de permisos</w:t>
+      </w:r>
+    </w:p>
+    <w:p>
+      <w:pPr>
+        <w:pStyle w:val="Prrafodelista"/>
+        <w:numPr>
+          <w:ilvl w:val="1"/>
+          <w:numId w:val="4"/>
+        </w:numPr>
+      </w:pPr>
+      <w:r>
+        <w:t>Características del sistema</w:t>
+      </w:r>
+    </w:p>
+    <w:p>
+      <w:pPr>
+        <w:pStyle w:val="Prrafodelista"/>
+        <w:numPr>
+          <w:ilvl w:val="2"/>
+          <w:numId w:val="4"/>
+        </w:numPr>
+      </w:pPr>
+      <w:r>
+        <w:t>Características principales</w:t>
+      </w:r>
+    </w:p>
+    <w:p>
+      <w:pPr>
+        <w:pStyle w:val="Prrafodelista"/>
+        <w:numPr>
+          <w:ilvl w:val="2"/>
+          <w:numId w:val="4"/>
+        </w:numPr>
+      </w:pPr>
+      <w:r>
+        <w:t>Funciones adicionales</w:t>
+      </w:r>
+    </w:p>
+    <w:p>
+      <w:pPr>
+        <w:pStyle w:val="Prrafodelista"/>
+        <w:numPr>
+          <w:ilvl w:val="1"/>
+          <w:numId w:val="4"/>
+        </w:numPr>
+      </w:pPr>
+      <w:r>
+        <w:t>Requisitos no funcionales</w:t>
+      </w:r>
+    </w:p>
+    <w:p>
+      <w:pPr>
+        <w:pStyle w:val="Prrafodelista"/>
+        <w:numPr>
+          <w:ilvl w:val="2"/>
+          <w:numId w:val="4"/>
+        </w:numPr>
+      </w:pPr>
+      <w:r>
+        <w:t>Requisitos de rendimiento</w:t>
+      </w:r>
+    </w:p>
+    <w:p>
+      <w:pPr>
+        <w:pStyle w:val="Prrafodelista"/>
+        <w:numPr>
+          <w:ilvl w:val="2"/>
+          <w:numId w:val="4"/>
+        </w:numPr>
+      </w:pPr>
+      <w:r>
+        <w:t>Requisitos de seguridad</w:t>
+      </w:r>
+    </w:p>
+    <w:p>
+      <w:pPr>
+        <w:pStyle w:val="Prrafodelista"/>
+        <w:numPr>
+          <w:ilvl w:val="2"/>
+          <w:numId w:val="4"/>
+        </w:numPr>
+      </w:pPr>
+      <w:r>
+        <w:t>Requisitos de usabilidad</w:t>
+      </w:r>
+    </w:p>
+    <w:p>
+      <w:pPr>
+        <w:pStyle w:val="Ttulo1"/>
         <w:numPr>
           <w:ilvl w:val="0"/>
-          <w:numId w:val="4"/>
-        </w:numPr>
-      </w:pPr>
-      <w:r>
-        <w:t>Cronograma y Metodología</w:t>
-      </w:r>
-    </w:p>
-    <w:p>
-      <w:pPr>
-        <w:pStyle w:val="Prrafodelista"/>
+          <w:numId w:val="17"/>
+        </w:numPr>
+      </w:pPr>
+      <w:r>
+        <w:lastRenderedPageBreak/>
+        <w:t xml:space="preserve">INTRODUCCIÓN </w:t>
+      </w:r>
+    </w:p>
+    <w:p>
+      <w:pPr>
+        <w:ind w:firstLine="709"/>
+        <w:jc w:val="both"/>
+        <w:rPr>
+          <w:sz w:val="24"/>
+          <w:szCs w:val="24"/>
+        </w:rPr>
+      </w:pPr>
+      <w:r>
+        <w:rPr>
+          <w:sz w:val="24"/>
+          <w:szCs w:val="24"/>
+        </w:rPr>
+        <w:t xml:space="preserve">Con este proyecto se busca la implementación de una aplicación para ser utilizada por cualquier usuario </w:t>
+      </w:r>
+      <w:r>
+        <w:rPr>
+          <w:sz w:val="24"/>
+          <w:szCs w:val="24"/>
+        </w:rPr>
+        <w:t>y que permita que los usuarios puedan expresar sus opiniones y compartir su vida, además de conectar a múltiples usuarios, mediante un servicio de mensajería virtual.</w:t>
+      </w:r>
+    </w:p>
+    <w:p>
+      <w:pPr>
+        <w:ind w:firstLine="709"/>
+        <w:jc w:val="both"/>
+        <w:rPr>
+          <w:sz w:val="24"/>
+          <w:szCs w:val="24"/>
+        </w:rPr>
+      </w:pPr>
+      <w:r>
+        <w:rPr>
+          <w:sz w:val="24"/>
+          <w:szCs w:val="24"/>
+        </w:rPr>
+        <w:t xml:space="preserve">Los tipos de servicios principales que deberá ofrecer son: creación, edición, eliminación y autenticación de usuarios; creación, edición, eliminación de publicaciones, comentarios en publicaciones y comentarios anidados en otros comentarios; creación y eliminación de espacios de conversación (chats, ya sean privados entre dos personas o grupales entre varias), etc. </w:t>
+      </w:r>
+    </w:p>
+    <w:p>
+      <w:pPr>
+        <w:pStyle w:val="Ttulo2"/>
+        <w:numPr>
+          <w:ilvl w:val="1"/>
+          <w:numId w:val="17"/>
+        </w:numPr>
+      </w:pPr>
+      <w:r>
+        <w:t>Objetivo</w:t>
+      </w:r>
+    </w:p>
+    <w:p>
+      <w:pPr>
+        <w:ind w:left="720" w:firstLine="709"/>
+        <w:jc w:val="both"/>
+      </w:pPr>
+      <w:r>
+        <w:rPr>
+          <w:sz w:val="24"/>
+          <w:szCs w:val="24"/>
+        </w:rPr>
+        <w:t xml:space="preserve">Con este documento se busca establecer formalmente los requerimientos del sistema. Este documento busca servir como una herramienta de consulta a la hora de diseñar, planificar, modelar e implementar el sistema, y verificar el resultado final, para evaluar si se ha cumplido con los requerimientos técnicos especificados.  </w:t>
+      </w:r>
+    </w:p>
+    <w:p>
+      <w:pPr>
+        <w:pStyle w:val="Ttulo2"/>
+        <w:numPr>
+          <w:ilvl w:val="1"/>
+          <w:numId w:val="17"/>
+        </w:numPr>
+      </w:pPr>
+      <w:r>
+        <w:t>Destinatarios</w:t>
+      </w:r>
+    </w:p>
+    <w:p>
+      <w:pPr>
+        <w:ind w:left="720" w:firstLine="709"/>
+        <w:jc w:val="both"/>
+        <w:rPr>
+          <w:sz w:val="24"/>
+          <w:szCs w:val="24"/>
+        </w:rPr>
+      </w:pPr>
+      <w:r>
+        <w:rPr>
+          <w:sz w:val="24"/>
+          <w:szCs w:val="24"/>
+        </w:rPr>
+        <w:t>Aquellos que podrán acceder a este documento son: el propio autor, que hará de desarrollador íntegro de la aplicación; y algunos profesores, que harán de editores para este mismo documento.</w:t>
+      </w:r>
+    </w:p>
+    <w:p>
+      <w:pPr>
+        <w:ind w:left="720" w:firstLine="709"/>
+        <w:jc w:val="both"/>
+        <w:rPr>
+          <w:sz w:val="24"/>
+          <w:szCs w:val="24"/>
+        </w:rPr>
+      </w:pPr>
+      <w:r>
+        <w:rPr>
+          <w:sz w:val="24"/>
+          <w:szCs w:val="24"/>
+        </w:rPr>
+        <w:t>Con respecto a la aplicación, aquellos que puedan acceder serán un grupo reducido para una fase de beta cerrada, en la cual se demostrará la funcionalidad y el diseño de la aplicación y, a su vez, este grupo reducido de usuarios podrá hacer críticas y sugerencias al resultado, permitiendo la modificación de ciertos aspectos y la mejora para una futura versión del proyecto.</w:t>
+      </w:r>
+    </w:p>
+    <w:p/>
+    <w:p/>
+    <w:p/>
+    <w:p/>
+    <w:p/>
+    <w:p/>
+    <w:p/>
+    <w:p/>
+    <w:p/>
+    <w:p/>
+    <w:p/>
+    <w:p/>
+    <w:p/>
+    <w:p>
+      <w:pPr>
+        <w:pStyle w:val="Ttulo1"/>
         <w:numPr>
           <w:ilvl w:val="0"/>
-          <w:numId w:val="4"/>
-        </w:numPr>
-      </w:pPr>
-      <w:r>
-        <w:t>Presupuesto y Gestión de Riesgos</w:t>
-      </w:r>
-    </w:p>
+          <w:numId w:val="17"/>
+        </w:numPr>
+      </w:pPr>
+      <w:r>
+        <w:t>DESCRIPCIÓN GENERAL</w:t>
+      </w:r>
+    </w:p>
+    <w:p>
+      <w:pPr>
+        <w:pStyle w:val="Ttulo2"/>
+        <w:ind w:firstLine="708"/>
+      </w:pPr>
+      <w:r>
+        <w:t xml:space="preserve">2.1 </w:t>
+      </w:r>
+      <w:r>
+        <w:t>Necesidades de los usuarios</w:t>
+      </w:r>
+    </w:p>
+    <w:p>
+      <w:pPr>
+        <w:pStyle w:val="Prrafodelista"/>
+        <w:ind w:left="1080"/>
+      </w:pPr>
+      <w:r>
+        <w:t>Los usuarios, dentro de la aplicación, deberán ser capaces de:</w:t>
+      </w:r>
+    </w:p>
+    <w:p>
+      <w:pPr>
+        <w:pStyle w:val="Prrafodelista"/>
+        <w:numPr>
+          <w:ilvl w:val="1"/>
+          <w:numId w:val="1"/>
+        </w:numPr>
+      </w:pPr>
+      <w:r>
+        <w:t>Crear cuentas: presentando cierta información vital (email, contraseña, etc.).</w:t>
+      </w:r>
+    </w:p>
+    <w:p>
+      <w:pPr>
+        <w:pStyle w:val="Prrafodelista"/>
+        <w:numPr>
+          <w:ilvl w:val="1"/>
+          <w:numId w:val="1"/>
+        </w:numPr>
+      </w:pPr>
+      <w:r>
+        <w:t>Editar cuentas: cambiar la información de una cuenta propia (email, contraseña, nombre de usuario, etc.)</w:t>
+      </w:r>
+    </w:p>
+    <w:p>
+      <w:pPr>
+        <w:pStyle w:val="Prrafodelista"/>
+        <w:numPr>
+          <w:ilvl w:val="1"/>
+          <w:numId w:val="1"/>
+        </w:numPr>
+      </w:pPr>
+      <w:r>
+        <w:t>Eliminar cuentas: inhabilitar una cuenta, impidiendo un futuro uso.</w:t>
+      </w:r>
+    </w:p>
+    <w:p>
+      <w:pPr>
+        <w:pStyle w:val="Prrafodelista"/>
+        <w:numPr>
+          <w:ilvl w:val="1"/>
+          <w:numId w:val="1"/>
+        </w:numPr>
+      </w:pPr>
+      <w:r>
+        <w:t>Denunciar cuentas: reportar usuarios por comportamientos ofensivos, u otra razón que amerite una sanción por parte de los administradores.</w:t>
+      </w:r>
+    </w:p>
+    <w:p>
+      <w:pPr>
+        <w:pStyle w:val="Prrafodelista"/>
+        <w:numPr>
+          <w:ilvl w:val="1"/>
+          <w:numId w:val="1"/>
+        </w:numPr>
+      </w:pPr>
+      <w:r>
+        <w:t>Bloquear cuentas: para impedir que se le recomiende contenido de estas cuentas, y que estas no puedan acceder a las publicaciones, comentarios, perfiles, etc., del usuario que los bloqueo.</w:t>
+      </w:r>
+    </w:p>
+    <w:p>
+      <w:pPr>
+        <w:pStyle w:val="Prrafodelista"/>
+        <w:numPr>
+          <w:ilvl w:val="1"/>
+          <w:numId w:val="1"/>
+        </w:numPr>
+      </w:pPr>
+      <w:r>
+        <w:t xml:space="preserve"> Seguir cuentas: para recibir una notificación cuando esta cuenta publique nuevo contenido, o para ser amigos y poder chatear si se siguen mutuamente.</w:t>
+      </w:r>
+    </w:p>
+    <w:p>
+      <w:pPr>
+        <w:pStyle w:val="Prrafodelista"/>
+        <w:numPr>
+          <w:ilvl w:val="1"/>
+          <w:numId w:val="1"/>
+        </w:numPr>
+      </w:pPr>
+      <w:r>
+        <w:t>Crear publicaciones: permitiendo expresar opiniones, compartir momentos, etc., con los otros usuarios.</w:t>
+      </w:r>
+    </w:p>
+    <w:p>
+      <w:pPr>
+        <w:pStyle w:val="Prrafodelista"/>
+        <w:numPr>
+          <w:ilvl w:val="1"/>
+          <w:numId w:val="1"/>
+        </w:numPr>
+      </w:pPr>
+      <w:r>
+        <w:t>Guardar publicaciones: para poder acceder posteriormente a estas desde un apartado de la aplicación.</w:t>
+      </w:r>
+    </w:p>
+    <w:p>
+      <w:pPr>
+        <w:pStyle w:val="Prrafodelista"/>
+        <w:numPr>
+          <w:ilvl w:val="1"/>
+          <w:numId w:val="1"/>
+        </w:numPr>
+      </w:pPr>
+      <w:r>
+        <w:t>Crear comentarios: permitiendo comentar en publicaciones o en otros comentarios.</w:t>
+      </w:r>
+    </w:p>
+    <w:p>
+      <w:pPr>
+        <w:pStyle w:val="Prrafodelista"/>
+        <w:numPr>
+          <w:ilvl w:val="1"/>
+          <w:numId w:val="1"/>
+        </w:numPr>
+      </w:pPr>
+      <w:r>
+        <w:t>Dar “me gusta”: a publicaciones o comentarios, demostrando tu apoyo hacia el autor.</w:t>
+      </w:r>
+    </w:p>
+    <w:p>
+      <w:pPr>
+        <w:pStyle w:val="Prrafodelista"/>
+        <w:numPr>
+          <w:ilvl w:val="1"/>
+          <w:numId w:val="1"/>
+        </w:numPr>
+      </w:pPr>
+      <w:r>
+        <w:t>Crear “chats”: permitiendo enviar mensajes directos a otros usuarios.</w:t>
+      </w:r>
+    </w:p>
+    <w:p>
+      <w:pPr>
+        <w:pStyle w:val="Ttulo2"/>
+      </w:pPr>
+      <w:r>
+        <w:t>2.2 Perspectiva del producto</w:t>
+      </w:r>
+    </w:p>
+    <w:p>
+      <w:pPr>
+        <w:pStyle w:val="Ttulo3"/>
+      </w:pPr>
+      <w:r>
+        <w:tab/>
+        <w:t>2.2.1 Interfases de usuario</w:t>
+      </w:r>
+    </w:p>
+    <w:p>
+      <w:r>
+        <w:t>Como la idea central del proyecto es crear una red social que será utilizada por usuarios que no necesariamente tengan formación técnica, la interfaz debe ser sencilla para su entendimiento, permitiendo su fácil utilización y navegación por la misma.</w:t>
+      </w:r>
+    </w:p>
+    <w:p>
+      <w:r>
+        <w:t xml:space="preserve">Esta interfaz, se planea, no debe tener una paleta de colores muy colorida ni estar cargada de botones, textos, o funciones y espacios innecesarios, para presentar un diseño moderno y minimalista. </w:t>
+      </w:r>
+    </w:p>
+    <w:p>
+      <w:r>
+        <w:t>A su vez, se debe dar a la opción al usuario entre una paleta de colores clara y otra oscura, para que este elija su tema de color preferido.</w:t>
+      </w:r>
+    </w:p>
+    <w:p>
+      <w:r>
+        <w:t>Con respecto a las operaciones que realicen dentro de la aplicación, se deben restringir ciertas operaciones, para evitar que un usuario modifique el perfil, la actividad, o las publicaciones de otro usuario, por ejemplo.</w:t>
+      </w:r>
+    </w:p>
+    <w:p>
+      <w:pPr>
+        <w:pStyle w:val="Ttulo3"/>
+      </w:pPr>
+      <w:r>
+        <w:tab/>
+        <w:t>2.2.2 Interfases de comunicación con el servidor</w:t>
+      </w:r>
+    </w:p>
+    <w:p>
+      <w:r>
+        <w:t xml:space="preserve">El apartado de cliente de la aplicación, también llamado “frontend”, deberá comunicarse con el servidor, también llamado “backend”, el cual contendrá gran parte de la lógica necesaria para realizar funciones que afecten los datos dentro de las bases de datos. Se planea que estas </w:t>
+      </w:r>
+      <w:r>
+        <w:lastRenderedPageBreak/>
+        <w:t xml:space="preserve">comunicaciones se realicen mediante peticiones de tipo GraphQL a una API de este mismo tipo. </w:t>
+      </w:r>
+    </w:p>
+    <w:p>
+      <w:pPr>
+        <w:pStyle w:val="Ttulo3"/>
+      </w:pPr>
+      <w:r>
+        <w:tab/>
+        <w:t>2.2.3 Interfases de comunicación con la base de datos</w:t>
+      </w:r>
+    </w:p>
+    <w:p>
+      <w:r>
+        <w:t>El apartado “backend” en el servidor deberá poder comunicarse, consultar, editar y agregar registros o información en las bases de datos, permitiendo que los datos perduren entre sesiones, y que múltiples clientes puedan acceder a estos datos.</w:t>
+      </w:r>
+    </w:p>
+    <w:p/>
+    <w:p/>
+    <w:p/>
+    <w:p/>
+    <w:p/>
+    <w:p/>
+    <w:p/>
+    <w:p/>
+    <w:p/>
+    <w:p/>
+    <w:p/>
+    <w:p/>
+    <w:p/>
+    <w:p/>
+    <w:p/>
+    <w:p/>
+    <w:p/>
+    <w:p/>
     <w:p/>
     <w:p/>
     <w:p/>
@@ -206,880 +839,159 @@
     <w:p>
       <w:pPr>
         <w:pStyle w:val="Ttulo1"/>
-        <w:rPr>
-          <w:b/>
-          <w:bCs/>
-          <w:u w:val="single"/>
-        </w:rPr>
-      </w:pPr>
-      <w:r>
-        <w:rPr>
-          <w:b/>
-          <w:bCs/>
-          <w:u w:val="single"/>
-        </w:rPr>
-        <w:lastRenderedPageBreak/>
-        <w:t>Resumen Ejecutivo y Objetivos</w:t>
+        <w:numPr>
+          <w:ilvl w:val="0"/>
+          <w:numId w:val="17"/>
+        </w:numPr>
+      </w:pPr>
+      <w:r>
+        <w:t>CARACTERÍSTICAS Y REQUISITOS DEL SISTEMA</w:t>
       </w:r>
     </w:p>
     <w:p>
       <w:pPr>
         <w:pStyle w:val="Ttulo2"/>
         <w:numPr>
-          <w:ilvl w:val="0"/>
-          <w:numId w:val="1"/>
-        </w:numPr>
-      </w:pPr>
-      <w:r>
-        <w:t xml:space="preserve">Descripción del proyecto: </w:t>
-      </w:r>
-    </w:p>
-    <w:p>
-      <w:pPr>
-        <w:pStyle w:val="Prrafodelista"/>
-      </w:pPr>
-      <w:r>
-        <w:t>A lo largo de este proyecto se busca planificar, diseñar y construir una aplicación WEB, que servirá a modo de red social pequeña y simple. En esta misma aplicación los futuros usuarios serán capaces de crear cuentas, autenticarse en estas cuentas, crear publicaciones, ver las publicaciones de otros usuarios, dar “likes” y comentar en las publicaciones que les gusten, seguir a otros usuarios, bloquear o reportar a otros usuarios, además de iniciar conversaciones –ya sean privados o en grupales— con otros usuarios mediante chats.</w:t>
+          <w:ilvl w:val="1"/>
+          <w:numId w:val="17"/>
+        </w:numPr>
+      </w:pPr>
+      <w:r>
+        <w:t>Requisitos funcionales</w:t>
       </w:r>
     </w:p>
     <w:p>
       <w:pPr>
         <w:pStyle w:val="Ttulo2"/>
         <w:numPr>
-          <w:ilvl w:val="0"/>
-          <w:numId w:val="1"/>
-        </w:numPr>
-      </w:pPr>
-      <w:r>
-        <w:t>Objetivos del negocio:</w:t>
-      </w:r>
-    </w:p>
-    <w:p>
-      <w:pPr>
-        <w:ind w:left="720"/>
-      </w:pPr>
-      <w:r>
-        <w:t>Una vez que el proyecto se haya “terminado”, se espera que sea capaz de:</w:t>
-      </w:r>
-    </w:p>
-    <w:p>
-      <w:pPr>
-        <w:pStyle w:val="Prrafodelista"/>
-        <w:numPr>
-          <w:ilvl w:val="0"/>
-          <w:numId w:val="5"/>
-        </w:numPr>
-      </w:pPr>
-      <w:r>
-        <w:t>Permitir el manejo de los usuarios</w:t>
-      </w:r>
-      <w:r>
-        <w:t xml:space="preserve">: </w:t>
-      </w:r>
-      <w:r>
-        <w:t>crea</w:t>
-      </w:r>
-      <w:r>
-        <w:t>r</w:t>
-      </w:r>
-      <w:r>
-        <w:t>, elimina</w:t>
-      </w:r>
-      <w:r>
-        <w:t>r</w:t>
-      </w:r>
-      <w:r>
-        <w:t>, reportar</w:t>
-      </w:r>
-      <w:r>
-        <w:t>, editar</w:t>
-      </w:r>
-      <w:r>
-        <w:t>, bloquear, seguir</w:t>
-      </w:r>
-      <w:r>
-        <w:t xml:space="preserve"> o reportar cuentas.</w:t>
-      </w:r>
-    </w:p>
-    <w:p>
-      <w:pPr>
-        <w:pStyle w:val="Prrafodelista"/>
-        <w:numPr>
-          <w:ilvl w:val="0"/>
-          <w:numId w:val="5"/>
-        </w:numPr>
-      </w:pPr>
-      <w:r>
-        <w:t>Permitir el manejo de publicaciones por parte de los usuarios</w:t>
-      </w:r>
-      <w:r>
-        <w:t xml:space="preserve">: </w:t>
-      </w:r>
-      <w:r>
-        <w:t>crear, eliminar, editar, reportar, guardar o comentar en publicaciones.</w:t>
-      </w:r>
-    </w:p>
-    <w:p>
-      <w:pPr>
-        <w:pStyle w:val="Prrafodelista"/>
-        <w:numPr>
-          <w:ilvl w:val="0"/>
-          <w:numId w:val="5"/>
-        </w:numPr>
-      </w:pPr>
-      <w:r>
-        <w:t>Permitir que los usuarios sean capaces de comentar en publicaciones</w:t>
-      </w:r>
-      <w:r>
-        <w:t xml:space="preserve">: </w:t>
-      </w:r>
-      <w:r>
-        <w:t>crear, eliminar, editar, reportar, guardar o comentar –anidación de comentarios— en comentarios de publicaciones.</w:t>
-      </w:r>
-    </w:p>
-    <w:p>
-      <w:pPr>
-        <w:pStyle w:val="Prrafodelista"/>
-        <w:numPr>
-          <w:ilvl w:val="0"/>
-          <w:numId w:val="5"/>
-        </w:numPr>
-      </w:pPr>
-      <w:r>
-        <w:t>Permitir la creación de chats entre usuarios: ya sea con un chat privado o con uno grupal, los usuarios deberán ser capaces de chatear y comunicarse entre sí, aunque solo con usuario que se sigan mutuamente.</w:t>
-      </w:r>
-    </w:p>
-    <w:p>
-      <w:pPr>
-        <w:pStyle w:val="Prrafodelista"/>
-        <w:numPr>
-          <w:ilvl w:val="0"/>
-          <w:numId w:val="5"/>
-        </w:numPr>
-      </w:pPr>
-      <w:r>
-        <w:t>Mantener la privacidad de los usuarios: un usuario será capaz de elegir el nivel de privacidad que quiera: público, todos podrán ver a qué le da like, sus publicaciones, etc.; solo amigos, solo sus amigos podrán ver su actividad; o privado, nadie podrá ver su actividad en la plataforma.</w:t>
-      </w:r>
-    </w:p>
-    <w:p>
-      <w:pPr>
-        <w:pStyle w:val="Prrafodelista"/>
-        <w:numPr>
-          <w:ilvl w:val="0"/>
-          <w:numId w:val="5"/>
-        </w:numPr>
-      </w:pPr>
-      <w:r>
-        <w:t>Manejo de roles y permisos de usuarios: un usuario solo puede manejar su propia actividad (publicaciones, comentarios, bloqueos, likes, etc.); y un administrador podrá manejar el contenido y la actividad de los usuarios, deberá ser capaz de eliminar publicaciones, comentarios o perfiles de otros usuarios, entre otros permisos especiales de control y auditoría a lo largo de la plataforma.</w:t>
-      </w:r>
-    </w:p>
-    <w:p>
-      <w:pPr>
-        <w:pStyle w:val="Prrafodelista"/>
-        <w:numPr>
-          <w:ilvl w:val="0"/>
-          <w:numId w:val="5"/>
-        </w:numPr>
-      </w:pPr>
-      <w:r>
-        <w:t>Mantener una correcta auditoría con la base de datos: cada registro deberá tener fechas de creación, edición y eliminación (por lo que no será realmente eliminado), además se deberán agregar tablas en la base de datos que permitan almacenar la información de edición de los registros (cuándo se editó, por quién se editó, qué se editó y cómo se editó).</w:t>
-      </w:r>
-    </w:p>
-    <w:p>
-      <w:pPr>
-        <w:pStyle w:val="Prrafodelista"/>
-        <w:numPr>
-          <w:ilvl w:val="0"/>
-          <w:numId w:val="5"/>
-        </w:numPr>
-      </w:pPr>
-      <w:r>
-        <w:t>La aplicación deberá estar disponible para su uso: una vez realizada la aplicación, esta deberá ser desplegada en un servidor para su posterior muestra al público y a los docentes.</w:t>
-      </w:r>
-    </w:p>
-    <w:p>
-      <w:pPr>
-        <w:pStyle w:val="Prrafodelista"/>
-        <w:ind w:left="1440"/>
-      </w:pPr>
+          <w:ilvl w:val="2"/>
+          <w:numId w:val="17"/>
+        </w:numPr>
+      </w:pPr>
+      <w:r>
+        <w:t>Manejo de usuarios</w:t>
+      </w:r>
+    </w:p>
+    <w:p>
+      <w:r>
+        <w:t>La aplicación final deberá ser capaz de manejar las solicitudes de múltiples usuarios de forma simultánea, aunque a una cantidad reducida de estos debido a la escala del proyecto.</w:t>
+      </w:r>
+    </w:p>
+    <w:p>
+      <w:r>
+        <w:t>La aplicación final deberá poder manejar a estos usuarios, almacenar su información, contestar a sus solicitudes y añadir o actualizar información en la base de datos según sea ordenado, ya sea por un usuario o por un</w:t>
+      </w:r>
+      <w:r>
+        <w:t xml:space="preserve"> administrador</w:t>
+      </w:r>
+      <w:r>
+        <w:t>.</w:t>
+      </w:r>
+    </w:p>
+    <w:p>
+      <w:r>
+        <w:t>La aplicación deberá respetar los ajustes de preferencias establecidos por el usuario (privacidad, tema de color, usuarios bloqueados, etc.).</w:t>
+      </w:r>
       <w:r>
         <w:t xml:space="preserve"> </w:t>
       </w:r>
     </w:p>
     <w:p>
       <w:pPr>
-        <w:pStyle w:val="Prrafodelista"/>
-      </w:pPr>
-      <w:r>
-        <w:t>Sin embargo, y más allá de la realización final del proyecto, y alcanzar estos objetivos, la principal meta</w:t>
-      </w:r>
-      <w:r>
-        <w:t xml:space="preserve"> de la puesta en marcha de este proyecto</w:t>
-      </w:r>
-      <w:r>
-        <w:t xml:space="preserve"> </w:t>
-      </w:r>
-      <w:r>
-        <w:t>es la obtención de experiencia en la planificación, la organización, el diseño y la creación de proyectos personales por parte del autor, con el fin de crear un port</w:t>
-      </w:r>
-      <w:r>
-        <w:t>a</w:t>
-      </w:r>
-      <w:r>
-        <w:t>folio.</w:t>
-      </w:r>
-    </w:p>
-    <w:p>
-      <w:pPr>
         <w:pStyle w:val="Ttulo2"/>
         <w:numPr>
-          <w:ilvl w:val="0"/>
-          <w:numId w:val="1"/>
-        </w:numPr>
-      </w:pPr>
-      <w:r>
-        <w:lastRenderedPageBreak/>
-        <w:t>Público objetivo:</w:t>
-      </w:r>
-    </w:p>
-    <w:p>
-      <w:pPr>
-        <w:ind w:left="708"/>
-      </w:pPr>
-      <w:r>
-        <w:t>La aplicación final tendrá una audiencia objetivo pequeña, pues es un proyecto personal con fines de aprendizaje, por lo que no estará pensada para ser usada por muchos usuarios.</w:t>
-      </w:r>
-    </w:p>
-    <w:p>
-      <w:pPr>
-        <w:ind w:left="708"/>
-      </w:pPr>
-      <w:r>
-        <w:t>El público que utilizará el producto final será, a lo sumo, mis mismos compañeros de clases, a modo de prueba y presentación de este producto.</w:t>
-      </w:r>
-    </w:p>
-    <w:p>
-      <w:pPr>
-        <w:ind w:left="708"/>
-      </w:pPr>
-    </w:p>
-    <w:p>
-      <w:pPr>
-        <w:ind w:left="708"/>
-      </w:pPr>
-    </w:p>
-    <w:p>
-      <w:pPr>
-        <w:ind w:left="708"/>
-      </w:pPr>
-    </w:p>
-    <w:p>
-      <w:pPr>
-        <w:ind w:left="708"/>
-      </w:pPr>
-    </w:p>
-    <w:p>
-      <w:pPr>
-        <w:ind w:left="708"/>
-      </w:pPr>
-    </w:p>
-    <w:p>
-      <w:pPr>
-        <w:ind w:left="708"/>
-      </w:pPr>
-    </w:p>
-    <w:p>
-      <w:pPr>
-        <w:ind w:left="708"/>
-      </w:pPr>
-    </w:p>
-    <w:p>
-      <w:pPr>
-        <w:ind w:left="708"/>
-      </w:pPr>
-    </w:p>
-    <w:p>
-      <w:pPr>
-        <w:ind w:left="708"/>
-      </w:pPr>
-    </w:p>
-    <w:p>
-      <w:pPr>
-        <w:ind w:left="708"/>
-      </w:pPr>
-    </w:p>
-    <w:p>
-      <w:pPr>
-        <w:ind w:left="708"/>
-      </w:pPr>
-    </w:p>
-    <w:p>
-      <w:pPr>
-        <w:ind w:left="708"/>
-      </w:pPr>
-    </w:p>
-    <w:p>
-      <w:pPr>
-        <w:ind w:left="708"/>
-      </w:pPr>
-    </w:p>
-    <w:p>
-      <w:pPr>
-        <w:ind w:left="708"/>
-      </w:pPr>
-    </w:p>
-    <w:p>
-      <w:pPr>
-        <w:ind w:left="708"/>
-      </w:pPr>
-    </w:p>
-    <w:p>
-      <w:pPr>
-        <w:ind w:left="708"/>
-      </w:pPr>
-    </w:p>
-    <w:p>
-      <w:pPr>
-        <w:ind w:left="708"/>
-      </w:pPr>
-    </w:p>
-    <w:p>
-      <w:pPr>
-        <w:ind w:left="708"/>
-      </w:pPr>
-    </w:p>
-    <w:p>
-      <w:pPr>
-        <w:ind w:left="708"/>
-      </w:pPr>
-    </w:p>
-    <w:p>
-      <w:pPr>
-        <w:ind w:left="708"/>
-      </w:pPr>
-    </w:p>
-    <w:p>
-      <w:pPr>
-        <w:ind w:left="708"/>
-      </w:pPr>
-    </w:p>
-    <w:p>
-      <w:pPr>
-        <w:ind w:left="708"/>
-      </w:pPr>
-    </w:p>
-    <w:p>
-      <w:pPr>
-        <w:ind w:left="708"/>
-      </w:pPr>
-    </w:p>
-    <w:p>
-      <w:pPr>
-        <w:ind w:left="708"/>
-      </w:pPr>
-    </w:p>
-    <w:p>
-      <w:pPr>
-        <w:ind w:left="708"/>
-      </w:pPr>
-    </w:p>
-    <w:p>
-      <w:pPr>
-        <w:ind w:left="708"/>
-      </w:pPr>
-    </w:p>
-    <w:p>
-      <w:pPr>
-        <w:pStyle w:val="Ttulo1"/>
-        <w:rPr>
-          <w:b/>
-          <w:bCs/>
-          <w:u w:val="single"/>
-        </w:rPr>
-      </w:pPr>
-      <w:r>
-        <w:rPr>
-          <w:b/>
-          <w:bCs/>
-          <w:u w:val="single"/>
-        </w:rPr>
-        <w:lastRenderedPageBreak/>
-        <w:t>Alcance y Entregables</w:t>
+          <w:ilvl w:val="2"/>
+          <w:numId w:val="17"/>
+        </w:numPr>
+      </w:pPr>
+      <w:r>
+        <w:t>Manejo de chats</w:t>
+      </w:r>
+    </w:p>
+    <w:p>
+      <w:r>
+        <w:t>La aplicación final deberá soportar la utilización de múltiples canales de conversación de forma simultánea.</w:t>
+      </w:r>
+    </w:p>
+    <w:p>
+      <w:r>
+        <w:t>La aplicación final deberá poder manejar estos chats, almacenar su información, agregar o editar registros de mensajes según petición de los usuarios que participen en estos; y emitir peticiones de actualización cuando detecten que hay nuevos registros en la base de datos (suscripción), lo que permitirá una comunicación en tiempo real entre los usuarios.</w:t>
       </w:r>
     </w:p>
     <w:p>
       <w:pPr>
         <w:pStyle w:val="Ttulo2"/>
         <w:numPr>
-          <w:ilvl w:val="0"/>
-          <w:numId w:val="1"/>
-        </w:numPr>
-      </w:pPr>
-      <w:r>
-        <w:t>Funcionalidades Principales:</w:t>
-      </w:r>
-    </w:p>
-    <w:p>
-      <w:pPr>
-        <w:pStyle w:val="Prrafodelista"/>
-        <w:numPr>
-          <w:ilvl w:val="0"/>
-          <w:numId w:val="6"/>
-        </w:numPr>
-      </w:pPr>
-      <w:r>
-        <w:t>Manejo de usuarios.</w:t>
-      </w:r>
-    </w:p>
-    <w:p>
-      <w:pPr>
-        <w:pStyle w:val="Prrafodelista"/>
-        <w:numPr>
-          <w:ilvl w:val="0"/>
-          <w:numId w:val="6"/>
-        </w:numPr>
-      </w:pPr>
-      <w:r>
-        <w:t>Manejo de publicaciones creadas por los usuarios.</w:t>
-      </w:r>
-    </w:p>
-    <w:p>
-      <w:pPr>
-        <w:pStyle w:val="Prrafodelista"/>
-        <w:numPr>
-          <w:ilvl w:val="0"/>
-          <w:numId w:val="6"/>
-        </w:numPr>
-      </w:pPr>
-      <w:r>
-        <w:t>Manejo de comentarios en publicaciones.</w:t>
-      </w:r>
-    </w:p>
-    <w:p>
-      <w:pPr>
-        <w:pStyle w:val="Prrafodelista"/>
-        <w:numPr>
-          <w:ilvl w:val="0"/>
-          <w:numId w:val="6"/>
-        </w:numPr>
-      </w:pPr>
-      <w:r>
-        <w:t>Manejo de comentarios anidados.</w:t>
-      </w:r>
-    </w:p>
-    <w:p>
-      <w:pPr>
-        <w:pStyle w:val="Prrafodelista"/>
-        <w:numPr>
-          <w:ilvl w:val="0"/>
-          <w:numId w:val="6"/>
-        </w:numPr>
-      </w:pPr>
-      <w:r>
-        <w:t>Las publicaciones deberán ser capaces de almacenar archivos multimedia.</w:t>
-      </w:r>
-    </w:p>
-    <w:p>
-      <w:pPr>
-        <w:pStyle w:val="Prrafodelista"/>
-        <w:numPr>
-          <w:ilvl w:val="0"/>
-          <w:numId w:val="6"/>
-        </w:numPr>
-      </w:pPr>
-      <w:r>
-        <w:t>Los usuarios deberán poder crear chats privados o grupales.</w:t>
-      </w:r>
-    </w:p>
-    <w:p>
-      <w:pPr>
-        <w:pStyle w:val="Prrafodelista"/>
-        <w:numPr>
-          <w:ilvl w:val="0"/>
-          <w:numId w:val="6"/>
-        </w:numPr>
-      </w:pPr>
-      <w:r>
-        <w:t>Los usuarios deberán tener permisos para gestionar su propia cuenta, publicaciones y actividad.</w:t>
-      </w:r>
-    </w:p>
-    <w:p>
-      <w:pPr>
-        <w:pStyle w:val="Prrafodelista"/>
-        <w:numPr>
-          <w:ilvl w:val="0"/>
-          <w:numId w:val="6"/>
-        </w:numPr>
-      </w:pPr>
-      <w:r>
-        <w:t>Los administradores deberán tener permisos para gestionar cuentas</w:t>
-      </w:r>
-      <w:r>
-        <w:t>, publicaciones y comentarios externos, además de ser capaces de acceder a las tablas (de la base de datos) de control de la comunidad (reportes, bloqueos, ediciones, etc.).</w:t>
-      </w:r>
-    </w:p>
-    <w:p>
-      <w:pPr>
-        <w:pStyle w:val="Prrafodelista"/>
-        <w:numPr>
-          <w:ilvl w:val="0"/>
-          <w:numId w:val="6"/>
-        </w:numPr>
-      </w:pPr>
-      <w:r>
-        <w:t>Los usuarios deberán ser capaces de recibir notificaciones, si lo permiten, sobre nuevas publicaciones de usuarios que sigan, si alguien le dio like a su publicación, si han recibido un nuevo mensaje o si alguien los empezó a seguir.</w:t>
+          <w:ilvl w:val="2"/>
+          <w:numId w:val="17"/>
+        </w:numPr>
+      </w:pPr>
+      <w:r>
+        <w:t>Manejo de publicaciones y comentarios</w:t>
+      </w:r>
+    </w:p>
+    <w:p>
+      <w:r>
+        <w:t>La aplicación final deberá permitir que los usuarios creen publicaciones y comentarios, realizando operaciones que interactúen con la base de datos y permitan la creación, eliminación, edición, reporte, y la obtención de registros de publicaciones y comentarios</w:t>
+      </w:r>
+      <w:r>
+        <w:t xml:space="preserve"> a petición de los usuarios.</w:t>
       </w:r>
     </w:p>
     <w:p>
       <w:pPr>
         <w:pStyle w:val="Ttulo2"/>
         <w:numPr>
-          <w:ilvl w:val="0"/>
-          <w:numId w:val="1"/>
-        </w:numPr>
-      </w:pPr>
-      <w:r>
-        <w:t>Lo que NO incluye:</w:t>
-      </w:r>
-    </w:p>
-    <w:p>
-      <w:pPr>
-        <w:pStyle w:val="Prrafodelista"/>
-        <w:numPr>
-          <w:ilvl w:val="0"/>
-          <w:numId w:val="8"/>
-        </w:numPr>
-      </w:pPr>
-      <w:r>
-        <w:t>Videollamadas (al menos no de momento).</w:t>
-      </w:r>
-    </w:p>
-    <w:p>
-      <w:pPr>
-        <w:pStyle w:val="Prrafodelista"/>
-        <w:numPr>
-          <w:ilvl w:val="0"/>
-          <w:numId w:val="8"/>
-        </w:numPr>
-      </w:pPr>
-      <w:r>
-        <w:t>Sistema de comentarios en perfiles.</w:t>
-      </w:r>
-    </w:p>
-    <w:p>
-      <w:pPr>
-        <w:pStyle w:val="Prrafodelista"/>
-        <w:numPr>
-          <w:ilvl w:val="0"/>
-          <w:numId w:val="8"/>
-        </w:numPr>
-      </w:pPr>
-      <w:r>
-        <w:t>Conexión con aplicaciones de terceros.</w:t>
-      </w:r>
-    </w:p>
-    <w:p>
-      <w:pPr>
-        <w:pStyle w:val="Prrafodelista"/>
-        <w:numPr>
-          <w:ilvl w:val="0"/>
-          <w:numId w:val="8"/>
-        </w:numPr>
-      </w:pPr>
-      <w:r>
-        <w:t>Menciones a otros usuarios en publicaciones o comentarios.</w:t>
-      </w:r>
-    </w:p>
-    <w:p>
-      <w:pPr>
-        <w:pStyle w:val="Prrafodelista"/>
-        <w:numPr>
-          <w:ilvl w:val="0"/>
-          <w:numId w:val="8"/>
-        </w:numPr>
-      </w:pPr>
-      <w:r>
-        <w:t>Algún sistema de monetización.</w:t>
-      </w:r>
-    </w:p>
-    <w:p>
-      <w:pPr>
-        <w:pStyle w:val="Prrafodelista"/>
-        <w:numPr>
-          <w:ilvl w:val="0"/>
-          <w:numId w:val="8"/>
-        </w:numPr>
-      </w:pPr>
-      <w:r>
-        <w:t>Algoritmos para recomendación de contenido.</w:t>
-      </w:r>
-    </w:p>
-    <w:p>
-      <w:pPr>
-        <w:pStyle w:val="Prrafodelista"/>
-        <w:numPr>
-          <w:ilvl w:val="0"/>
-          <w:numId w:val="8"/>
-        </w:numPr>
-      </w:pPr>
-      <w:r>
-        <w:t>Recomendación de usuarios.</w:t>
-      </w:r>
-    </w:p>
-    <w:p/>
-    <w:p/>
-    <w:p/>
-    <w:p/>
-    <w:p/>
-    <w:p/>
-    <w:p/>
-    <w:p/>
-    <w:p/>
-    <w:p/>
-    <w:p/>
-    <w:p/>
-    <w:p/>
-    <w:p/>
-    <w:p>
-      <w:pPr>
-        <w:pStyle w:val="Ttulo1"/>
-        <w:rPr>
-          <w:b/>
-          <w:bCs/>
-          <w:u w:val="single"/>
-        </w:rPr>
-      </w:pPr>
-      <w:r>
-        <w:rPr>
-          <w:b/>
-          <w:bCs/>
-          <w:u w:val="single"/>
-        </w:rPr>
-        <w:lastRenderedPageBreak/>
-        <w:t>Requerimientos Técnicos y Diseño</w:t>
+          <w:ilvl w:val="2"/>
+          <w:numId w:val="17"/>
+        </w:numPr>
+      </w:pPr>
+      <w:r>
+        <w:t>Manejo de información de usuarios</w:t>
+      </w:r>
+    </w:p>
+    <w:p>
+      <w:r>
+        <w:t>La información de los usuarios deberá ser manejada con cuidado, respetando las preferencias de visibilidad establecidas por cada usuario y los bloqueos entre usuarios. Además, la información deberá ser formateada para evitar la distribución de información sensible.</w:t>
       </w:r>
     </w:p>
     <w:p>
       <w:pPr>
         <w:pStyle w:val="Ttulo2"/>
         <w:numPr>
-          <w:ilvl w:val="0"/>
-          <w:numId w:val="1"/>
-        </w:numPr>
-      </w:pPr>
-      <w:r>
-        <w:t>Stack tecnológico:</w:t>
-      </w:r>
-    </w:p>
-    <w:p>
-      <w:pPr>
-        <w:ind w:left="708"/>
-      </w:pPr>
-      <w:r>
-        <w:t>A lo largo del proyecto se usará el siguiente stack tecnológico:</w:t>
-      </w:r>
-    </w:p>
-    <w:p>
-      <w:pPr>
-        <w:pStyle w:val="Prrafodelista"/>
-        <w:numPr>
-          <w:ilvl w:val="0"/>
-          <w:numId w:val="9"/>
-        </w:numPr>
-      </w:pPr>
-      <w:r>
-        <w:t>TypeScript: como lenguaje de programación primario.</w:t>
-      </w:r>
-    </w:p>
-    <w:p>
-      <w:pPr>
-        <w:pStyle w:val="Prrafodelista"/>
-        <w:numPr>
-          <w:ilvl w:val="0"/>
-          <w:numId w:val="9"/>
-        </w:numPr>
-      </w:pPr>
-      <w:r>
-        <w:t>React: como framework primario para el frontend</w:t>
-      </w:r>
-      <w:r>
-        <w:t>.</w:t>
-      </w:r>
-    </w:p>
-    <w:p>
-      <w:pPr>
-        <w:pStyle w:val="Prrafodelista"/>
-        <w:numPr>
-          <w:ilvl w:val="0"/>
-          <w:numId w:val="9"/>
-        </w:numPr>
-      </w:pPr>
-      <w:r>
-        <w:t>PostrgreSQL: como el modelo de bases de datos primarios en toda la aplicación.</w:t>
-      </w:r>
-    </w:p>
-    <w:p>
-      <w:pPr>
-        <w:pStyle w:val="Prrafodelista"/>
-        <w:numPr>
-          <w:ilvl w:val="0"/>
-          <w:numId w:val="9"/>
-        </w:numPr>
-      </w:pPr>
-      <w:r>
-        <w:t>NodeJS: para la creación del entorno de ejecución del backend.</w:t>
-      </w:r>
-    </w:p>
-    <w:p>
-      <w:pPr>
-        <w:pStyle w:val="Prrafodelista"/>
-        <w:numPr>
-          <w:ilvl w:val="0"/>
-          <w:numId w:val="9"/>
-        </w:numPr>
-      </w:pPr>
-      <w:r>
-        <w:t>GraphQL: para la creación de resolvers y manejo de datos en el backend.</w:t>
-      </w:r>
-    </w:p>
-    <w:p>
-      <w:pPr>
-        <w:pStyle w:val="Prrafodelista"/>
-        <w:numPr>
-          <w:ilvl w:val="0"/>
-          <w:numId w:val="9"/>
-        </w:numPr>
-      </w:pPr>
-      <w:r>
-        <w:t>ApolloServer: para la utilización de GraphQL en el backend.</w:t>
-      </w:r>
-    </w:p>
-    <w:p>
-      <w:pPr>
-        <w:pStyle w:val="Prrafodelista"/>
-        <w:numPr>
-          <w:ilvl w:val="0"/>
-          <w:numId w:val="9"/>
-        </w:numPr>
-      </w:pPr>
-      <w:r>
-        <w:t>ApolloClient: para realizar peticiones GraphQL al backend desde el frontend.</w:t>
-      </w:r>
-    </w:p>
-    <w:p>
-      <w:pPr>
-        <w:pStyle w:val="Prrafodelista"/>
-        <w:numPr>
-          <w:ilvl w:val="0"/>
-          <w:numId w:val="9"/>
-        </w:numPr>
-      </w:pPr>
-      <w:r>
-        <w:t>Figma: para el prototipado de la interfaz de usuario.</w:t>
-      </w:r>
-    </w:p>
-    <w:p>
-      <w:pPr>
-        <w:pStyle w:val="Prrafodelista"/>
-        <w:numPr>
-          <w:ilvl w:val="0"/>
-          <w:numId w:val="9"/>
-        </w:numPr>
-      </w:pPr>
-      <w:r>
-        <w:t>DBDiagram.io: para la creación de esquemas de bases de datos.</w:t>
-      </w:r>
-    </w:p>
-    <w:p>
-      <w:pPr>
-        <w:pStyle w:val="Prrafodelista"/>
-        <w:numPr>
-          <w:ilvl w:val="0"/>
-          <w:numId w:val="9"/>
-        </w:numPr>
-      </w:pPr>
-      <w:r>
-        <w:t>Git: como herramienta para la gestión de versiones del proyecto.</w:t>
-      </w:r>
-    </w:p>
-    <w:p>
-      <w:pPr>
-        <w:pStyle w:val="Prrafodelista"/>
-        <w:numPr>
-          <w:ilvl w:val="0"/>
-          <w:numId w:val="9"/>
-        </w:numPr>
-      </w:pPr>
-      <w:r>
-        <w:t>GitHub: como servidor para almacenar el repositorio principal del proyecto, junto con su gestión de control de versiones.</w:t>
-      </w:r>
-    </w:p>
-    <w:p>
-      <w:pPr>
-        <w:pStyle w:val="Prrafodelista"/>
-        <w:numPr>
-          <w:ilvl w:val="0"/>
-          <w:numId w:val="9"/>
-        </w:numPr>
-      </w:pPr>
-      <w:r>
-        <w:t>Jsonwebtoken: para la creación de tokens virtuales para los usuarios.</w:t>
-      </w:r>
-    </w:p>
-    <w:p>
-      <w:pPr>
-        <w:pStyle w:val="Prrafodelista"/>
-        <w:numPr>
-          <w:ilvl w:val="0"/>
-          <w:numId w:val="9"/>
-        </w:numPr>
-      </w:pPr>
-      <w:r>
-        <w:t>Vitest: librería para realizar pruebas sobre el frontend.</w:t>
-      </w:r>
-    </w:p>
-    <w:p>
-      <w:pPr>
-        <w:pStyle w:val="Prrafodelista"/>
-        <w:numPr>
-          <w:ilvl w:val="0"/>
-          <w:numId w:val="9"/>
-        </w:numPr>
-      </w:pPr>
-      <w:r>
-        <w:t>Playwrigth: librería para realizar pruebas sobre la aplicación.</w:t>
-      </w:r>
-    </w:p>
-    <w:p>
-      <w:pPr>
-        <w:ind w:left="708"/>
-      </w:pPr>
-      <w:r>
-        <w:t>Cabe aclarar que este stack tecnológico no es definitivo, por lo que podrá ser cambiado a futuro, reemplazando componentes por otros, por ejemplo.</w:t>
+          <w:ilvl w:val="2"/>
+          <w:numId w:val="17"/>
+        </w:numPr>
+      </w:pPr>
+      <w:r>
+        <w:t>Manejo de reportes</w:t>
+      </w:r>
+    </w:p>
+    <w:p>
+      <w:r>
+        <w:t>Los reportes realizados por un usuario hacia otro serán almacenados en la base de datos, donde serán evaluados por un administrador, que llegará a la conclusión de desestimar la denuncia, o aplicar sanciones a los acusados.</w:t>
       </w:r>
     </w:p>
     <w:p>
       <w:pPr>
         <w:pStyle w:val="Ttulo2"/>
         <w:numPr>
-          <w:ilvl w:val="0"/>
-          <w:numId w:val="1"/>
-        </w:numPr>
-      </w:pPr>
-      <w:r>
-        <w:t>Diseño y UX:</w:t>
-      </w:r>
-    </w:p>
-    <w:p>
-      <w:pPr>
-        <w:pStyle w:val="Ttulo2"/>
-        <w:numPr>
-          <w:ilvl w:val="0"/>
-          <w:numId w:val="1"/>
-        </w:numPr>
-      </w:pPr>
-      <w:r>
-        <w:t>Arquitectura:</w:t>
+          <w:ilvl w:val="2"/>
+          <w:numId w:val="17"/>
+        </w:numPr>
+      </w:pPr>
+      <w:r>
+        <w:t>Manejo de permisos</w:t>
+      </w:r>
+    </w:p>
+    <w:p>
+      <w:r>
+        <w:t xml:space="preserve">La aplicación deberá ser capaz de determinar, y limitar las acciones de los usuarios según permisos, evitando que estos accedan a la información de otros usuarios, y puedan editar o eliminar la misma de la base de datos. </w:t>
+      </w:r>
+    </w:p>
+    <w:p>
+      <w:r>
+        <w:t>Con esto mismo, deberá evitar que los usuarios puedan realizar operaciones de administrar por la aplicación, como acceder a los reportes, modificar la información de la base de datos de forma no autorizada, etc.</w:t>
       </w:r>
     </w:p>
     <w:sectPr>
@@ -1095,6 +1007,386 @@
 <file path=word/numbering.xml><?xml version="1.0" encoding="utf-8"?>
 <w:numbering xmlns:wpc="http://schemas.microsoft.com/office/word/2010/wordprocessingCanvas" xmlns:cx="http://schemas.microsoft.com/office/drawing/2014/chartex" xmlns:cx1="http://schemas.microsoft.com/office/drawing/2015/9/8/chartex" xmlns:cx2="http://schemas.microsoft.com/office/drawing/2015/10/21/chartex" xmlns:cx3="http://schemas.microsoft.com/office/drawing/2016/5/9/chartex" xmlns:cx4="http://schemas.microsoft.com/office/drawing/2016/5/10/chartex" xmlns:cx5="http://schemas.microsoft.com/office/drawing/2016/5/11/chartex" xmlns:cx6="http://schemas.microsoft.com/office/drawing/2016/5/12/chartex" xmlns:cx7="http://schemas.microsoft.com/office/drawing/2016/5/13/chartex" xmlns:cx8="http://schemas.microsoft.com/office/drawing/2016/5/14/chartex" xmlns:mc="http://schemas.openxmlformats.org/markup-compatibility/2006" xmlns:aink="http://schemas.microsoft.com/office/drawing/2016/ink" xmlns:am3d="http://schemas.microsoft.com/office/drawing/2017/model3d" xmlns:o="urn:schemas-microsoft-com:office:office" xmlns:oel="http://schemas.microsoft.com/office/2019/extlst" xmlns:r="http://schemas.openxmlformats.org/officeDocument/2006/relationships" xmlns:m="http://schemas.openxmlformats.org/officeDocument/2006/math" xmlns:v="urn:schemas-microsoft-com:vml" xmlns:wp14="http://schemas.microsoft.com/office/word/2010/wordprocessingDrawing" xmlns:wp="http://schemas.openxmlformats.org/drawingml/2006/wordprocessingDrawing" xmlns:w10="urn:schemas-microsoft-com:office:word" xmlns:w="http://schemas.openxmlformats.org/wordprocessingml/2006/main" xmlns:w14="http://schemas.microsoft.com/office/word/2010/wordml" xmlns:w15="http://schemas.microsoft.com/office/word/2012/wordml" xmlns:w16cex="http://schemas.microsoft.com/office/word/2018/wordml/cex" xmlns:w16cid="http://schemas.microsoft.com/office/word/2016/wordml/cid" xmlns:w16="http://schemas.microsoft.com/office/word/2018/wordml" xmlns:w16sdtdh="http://schemas.microsoft.com/office/word/2020/wordml/sdtdatahash" xmlns:w16se="http://schemas.microsoft.com/office/word/2015/wordml/symex" xmlns:wpg="http://schemas.microsoft.com/office/word/2010/wordprocessingGroup" xmlns:wpi="http://schemas.microsoft.com/office/word/2010/wordprocessingInk" xmlns:wne="http://schemas.microsoft.com/office/word/2006/wordml" xmlns:wps="http://schemas.microsoft.com/office/word/2010/wordprocessingShape" mc:Ignorable="w14 w15 w16se w16cid w16 w16cex w16sdtdh wp14">
   <w:abstractNum w:abstractNumId="0" w15:restartNumberingAfterBreak="0">
+    <w:nsid w:val="046D00C7"/>
+    <w:multiLevelType w:val="multilevel"/>
+    <w:tmpl w:val="1EAC179C"/>
+    <w:lvl w:ilvl="0">
+      <w:start w:val="3"/>
+      <w:numFmt w:val="decimal"/>
+      <w:lvlText w:val="%1."/>
+      <w:lvlJc w:val="left"/>
+      <w:pPr>
+        <w:tabs>
+          <w:tab w:val="num" w:pos="720"/>
+        </w:tabs>
+        <w:ind w:left="720" w:hanging="360"/>
+      </w:pPr>
+    </w:lvl>
+    <w:lvl w:ilvl="1" w:tentative="1">
+      <w:start w:val="1"/>
+      <w:numFmt w:val="decimal"/>
+      <w:lvlText w:val="%2."/>
+      <w:lvlJc w:val="left"/>
+      <w:pPr>
+        <w:tabs>
+          <w:tab w:val="num" w:pos="1440"/>
+        </w:tabs>
+        <w:ind w:left="1440" w:hanging="360"/>
+      </w:pPr>
+    </w:lvl>
+    <w:lvl w:ilvl="2" w:tentative="1">
+      <w:start w:val="1"/>
+      <w:numFmt w:val="decimal"/>
+      <w:lvlText w:val="%3."/>
+      <w:lvlJc w:val="left"/>
+      <w:pPr>
+        <w:tabs>
+          <w:tab w:val="num" w:pos="2160"/>
+        </w:tabs>
+        <w:ind w:left="2160" w:hanging="360"/>
+      </w:pPr>
+    </w:lvl>
+    <w:lvl w:ilvl="3" w:tentative="1">
+      <w:start w:val="1"/>
+      <w:numFmt w:val="decimal"/>
+      <w:lvlText w:val="%4."/>
+      <w:lvlJc w:val="left"/>
+      <w:pPr>
+        <w:tabs>
+          <w:tab w:val="num" w:pos="2880"/>
+        </w:tabs>
+        <w:ind w:left="2880" w:hanging="360"/>
+      </w:pPr>
+    </w:lvl>
+    <w:lvl w:ilvl="4" w:tentative="1">
+      <w:start w:val="1"/>
+      <w:numFmt w:val="decimal"/>
+      <w:lvlText w:val="%5."/>
+      <w:lvlJc w:val="left"/>
+      <w:pPr>
+        <w:tabs>
+          <w:tab w:val="num" w:pos="3600"/>
+        </w:tabs>
+        <w:ind w:left="3600" w:hanging="360"/>
+      </w:pPr>
+    </w:lvl>
+    <w:lvl w:ilvl="5" w:tentative="1">
+      <w:start w:val="1"/>
+      <w:numFmt w:val="decimal"/>
+      <w:lvlText w:val="%6."/>
+      <w:lvlJc w:val="left"/>
+      <w:pPr>
+        <w:tabs>
+          <w:tab w:val="num" w:pos="4320"/>
+        </w:tabs>
+        <w:ind w:left="4320" w:hanging="360"/>
+      </w:pPr>
+    </w:lvl>
+    <w:lvl w:ilvl="6" w:tentative="1">
+      <w:start w:val="1"/>
+      <w:numFmt w:val="decimal"/>
+      <w:lvlText w:val="%7."/>
+      <w:lvlJc w:val="left"/>
+      <w:pPr>
+        <w:tabs>
+          <w:tab w:val="num" w:pos="5040"/>
+        </w:tabs>
+        <w:ind w:left="5040" w:hanging="360"/>
+      </w:pPr>
+    </w:lvl>
+    <w:lvl w:ilvl="7" w:tentative="1">
+      <w:start w:val="1"/>
+      <w:numFmt w:val="decimal"/>
+      <w:lvlText w:val="%8."/>
+      <w:lvlJc w:val="left"/>
+      <w:pPr>
+        <w:tabs>
+          <w:tab w:val="num" w:pos="5760"/>
+        </w:tabs>
+        <w:ind w:left="5760" w:hanging="360"/>
+      </w:pPr>
+    </w:lvl>
+    <w:lvl w:ilvl="8" w:tentative="1">
+      <w:start w:val="1"/>
+      <w:numFmt w:val="decimal"/>
+      <w:lvlText w:val="%9."/>
+      <w:lvlJc w:val="left"/>
+      <w:pPr>
+        <w:tabs>
+          <w:tab w:val="num" w:pos="6480"/>
+        </w:tabs>
+        <w:ind w:left="6480" w:hanging="360"/>
+      </w:pPr>
+    </w:lvl>
+  </w:abstractNum>
+  <w:abstractNum w:abstractNumId="1" w15:restartNumberingAfterBreak="0">
+    <w:nsid w:val="09BD4E78"/>
+    <w:multiLevelType w:val="multilevel"/>
+    <w:tmpl w:val="6C7AF56A"/>
+    <w:lvl w:ilvl="0">
+      <w:start w:val="1"/>
+      <w:numFmt w:val="decimal"/>
+      <w:lvlText w:val="%1."/>
+      <w:lvlJc w:val="left"/>
+      <w:pPr>
+        <w:ind w:left="720" w:hanging="360"/>
+      </w:pPr>
+    </w:lvl>
+    <w:lvl w:ilvl="1">
+      <w:start w:val="1"/>
+      <w:numFmt w:val="decimal"/>
+      <w:isLgl/>
+      <w:lvlText w:val="%1.%2"/>
+      <w:lvlJc w:val="left"/>
+      <w:pPr>
+        <w:ind w:left="1080" w:hanging="360"/>
+      </w:pPr>
+      <w:rPr>
+        <w:rFonts w:hint="default"/>
+      </w:rPr>
+    </w:lvl>
+    <w:lvl w:ilvl="2">
+      <w:start w:val="1"/>
+      <w:numFmt w:val="decimal"/>
+      <w:isLgl/>
+      <w:lvlText w:val="%1.%2.%3"/>
+      <w:lvlJc w:val="left"/>
+      <w:pPr>
+        <w:ind w:left="1800" w:hanging="720"/>
+      </w:pPr>
+      <w:rPr>
+        <w:rFonts w:hint="default"/>
+      </w:rPr>
+    </w:lvl>
+    <w:lvl w:ilvl="3">
+      <w:start w:val="1"/>
+      <w:numFmt w:val="decimal"/>
+      <w:isLgl/>
+      <w:lvlText w:val="%1.%2.%3.%4"/>
+      <w:lvlJc w:val="left"/>
+      <w:pPr>
+        <w:ind w:left="2160" w:hanging="720"/>
+      </w:pPr>
+      <w:rPr>
+        <w:rFonts w:hint="default"/>
+      </w:rPr>
+    </w:lvl>
+    <w:lvl w:ilvl="4">
+      <w:start w:val="1"/>
+      <w:numFmt w:val="decimal"/>
+      <w:isLgl/>
+      <w:lvlText w:val="%1.%2.%3.%4.%5"/>
+      <w:lvlJc w:val="left"/>
+      <w:pPr>
+        <w:ind w:left="2880" w:hanging="1080"/>
+      </w:pPr>
+      <w:rPr>
+        <w:rFonts w:hint="default"/>
+      </w:rPr>
+    </w:lvl>
+    <w:lvl w:ilvl="5">
+      <w:start w:val="1"/>
+      <w:numFmt w:val="decimal"/>
+      <w:isLgl/>
+      <w:lvlText w:val="%1.%2.%3.%4.%5.%6"/>
+      <w:lvlJc w:val="left"/>
+      <w:pPr>
+        <w:ind w:left="3240" w:hanging="1080"/>
+      </w:pPr>
+      <w:rPr>
+        <w:rFonts w:hint="default"/>
+      </w:rPr>
+    </w:lvl>
+    <w:lvl w:ilvl="6">
+      <w:start w:val="1"/>
+      <w:numFmt w:val="decimal"/>
+      <w:isLgl/>
+      <w:lvlText w:val="%1.%2.%3.%4.%5.%6.%7"/>
+      <w:lvlJc w:val="left"/>
+      <w:pPr>
+        <w:ind w:left="3960" w:hanging="1440"/>
+      </w:pPr>
+      <w:rPr>
+        <w:rFonts w:hint="default"/>
+      </w:rPr>
+    </w:lvl>
+    <w:lvl w:ilvl="7">
+      <w:start w:val="1"/>
+      <w:numFmt w:val="decimal"/>
+      <w:isLgl/>
+      <w:lvlText w:val="%1.%2.%3.%4.%5.%6.%7.%8"/>
+      <w:lvlJc w:val="left"/>
+      <w:pPr>
+        <w:ind w:left="4320" w:hanging="1440"/>
+      </w:pPr>
+      <w:rPr>
+        <w:rFonts w:hint="default"/>
+      </w:rPr>
+    </w:lvl>
+    <w:lvl w:ilvl="8">
+      <w:start w:val="1"/>
+      <w:numFmt w:val="decimal"/>
+      <w:isLgl/>
+      <w:lvlText w:val="%1.%2.%3.%4.%5.%6.%7.%8.%9"/>
+      <w:lvlJc w:val="left"/>
+      <w:pPr>
+        <w:ind w:left="4680" w:hanging="1440"/>
+      </w:pPr>
+      <w:rPr>
+        <w:rFonts w:hint="default"/>
+      </w:rPr>
+    </w:lvl>
+  </w:abstractNum>
+  <w:abstractNum w:abstractNumId="2" w15:restartNumberingAfterBreak="0">
+    <w:nsid w:val="0D0A602F"/>
+    <w:multiLevelType w:val="multilevel"/>
+    <w:tmpl w:val="73F624DE"/>
+    <w:lvl w:ilvl="0">
+      <w:start w:val="1"/>
+      <w:numFmt w:val="bullet"/>
+      <w:lvlText w:val=""/>
+      <w:lvlJc w:val="left"/>
+      <w:pPr>
+        <w:tabs>
+          <w:tab w:val="num" w:pos="720"/>
+        </w:tabs>
+        <w:ind w:left="720" w:hanging="360"/>
+      </w:pPr>
+      <w:rPr>
+        <w:rFonts w:ascii="Symbol" w:hAnsi="Symbol" w:hint="default"/>
+        <w:sz w:val="20"/>
+      </w:rPr>
+    </w:lvl>
+    <w:lvl w:ilvl="1">
+      <w:start w:val="1"/>
+      <w:numFmt w:val="bullet"/>
+      <w:lvlText w:val="o"/>
+      <w:lvlJc w:val="left"/>
+      <w:pPr>
+        <w:tabs>
+          <w:tab w:val="num" w:pos="1440"/>
+        </w:tabs>
+        <w:ind w:left="1440" w:hanging="360"/>
+      </w:pPr>
+      <w:rPr>
+        <w:rFonts w:ascii="Courier New" w:hAnsi="Courier New" w:hint="default"/>
+        <w:sz w:val="20"/>
+      </w:rPr>
+    </w:lvl>
+    <w:lvl w:ilvl="2" w:tentative="1">
+      <w:start w:val="1"/>
+      <w:numFmt w:val="bullet"/>
+      <w:lvlText w:val=""/>
+      <w:lvlJc w:val="left"/>
+      <w:pPr>
+        <w:tabs>
+          <w:tab w:val="num" w:pos="2160"/>
+        </w:tabs>
+        <w:ind w:left="2160" w:hanging="360"/>
+      </w:pPr>
+      <w:rPr>
+        <w:rFonts w:ascii="Wingdings" w:hAnsi="Wingdings" w:hint="default"/>
+        <w:sz w:val="20"/>
+      </w:rPr>
+    </w:lvl>
+    <w:lvl w:ilvl="3" w:tentative="1">
+      <w:start w:val="1"/>
+      <w:numFmt w:val="bullet"/>
+      <w:lvlText w:val=""/>
+      <w:lvlJc w:val="left"/>
+      <w:pPr>
+        <w:tabs>
+          <w:tab w:val="num" w:pos="2880"/>
+        </w:tabs>
+        <w:ind w:left="2880" w:hanging="360"/>
+      </w:pPr>
+      <w:rPr>
+        <w:rFonts w:ascii="Wingdings" w:hAnsi="Wingdings" w:hint="default"/>
+        <w:sz w:val="20"/>
+      </w:rPr>
+    </w:lvl>
+    <w:lvl w:ilvl="4" w:tentative="1">
+      <w:start w:val="1"/>
+      <w:numFmt w:val="bullet"/>
+      <w:lvlText w:val=""/>
+      <w:lvlJc w:val="left"/>
+      <w:pPr>
+        <w:tabs>
+          <w:tab w:val="num" w:pos="3600"/>
+        </w:tabs>
+        <w:ind w:left="3600" w:hanging="360"/>
+      </w:pPr>
+      <w:rPr>
+        <w:rFonts w:ascii="Wingdings" w:hAnsi="Wingdings" w:hint="default"/>
+        <w:sz w:val="20"/>
+      </w:rPr>
+    </w:lvl>
+    <w:lvl w:ilvl="5" w:tentative="1">
+      <w:start w:val="1"/>
+      <w:numFmt w:val="bullet"/>
+      <w:lvlText w:val=""/>
+      <w:lvlJc w:val="left"/>
+      <w:pPr>
+        <w:tabs>
+          <w:tab w:val="num" w:pos="4320"/>
+        </w:tabs>
+        <w:ind w:left="4320" w:hanging="360"/>
+      </w:pPr>
+      <w:rPr>
+        <w:rFonts w:ascii="Wingdings" w:hAnsi="Wingdings" w:hint="default"/>
+        <w:sz w:val="20"/>
+      </w:rPr>
+    </w:lvl>
+    <w:lvl w:ilvl="6" w:tentative="1">
+      <w:start w:val="1"/>
+      <w:numFmt w:val="bullet"/>
+      <w:lvlText w:val=""/>
+      <w:lvlJc w:val="left"/>
+      <w:pPr>
+        <w:tabs>
+          <w:tab w:val="num" w:pos="5040"/>
+        </w:tabs>
+        <w:ind w:left="5040" w:hanging="360"/>
+      </w:pPr>
+      <w:rPr>
+        <w:rFonts w:ascii="Wingdings" w:hAnsi="Wingdings" w:hint="default"/>
+        <w:sz w:val="20"/>
+      </w:rPr>
+    </w:lvl>
+    <w:lvl w:ilvl="7" w:tentative="1">
+      <w:start w:val="1"/>
+      <w:numFmt w:val="bullet"/>
+      <w:lvlText w:val=""/>
+      <w:lvlJc w:val="left"/>
+      <w:pPr>
+        <w:tabs>
+          <w:tab w:val="num" w:pos="5760"/>
+        </w:tabs>
+        <w:ind w:left="5760" w:hanging="360"/>
+      </w:pPr>
+      <w:rPr>
+        <w:rFonts w:ascii="Wingdings" w:hAnsi="Wingdings" w:hint="default"/>
+        <w:sz w:val="20"/>
+      </w:rPr>
+    </w:lvl>
+    <w:lvl w:ilvl="8" w:tentative="1">
+      <w:start w:val="1"/>
+      <w:numFmt w:val="bullet"/>
+      <w:lvlText w:val=""/>
+      <w:lvlJc w:val="left"/>
+      <w:pPr>
+        <w:tabs>
+          <w:tab w:val="num" w:pos="6480"/>
+        </w:tabs>
+        <w:ind w:left="6480" w:hanging="360"/>
+      </w:pPr>
+      <w:rPr>
+        <w:rFonts w:ascii="Wingdings" w:hAnsi="Wingdings" w:hint="default"/>
+        <w:sz w:val="20"/>
+      </w:rPr>
+    </w:lvl>
+  </w:abstractNum>
+  <w:abstractNum w:abstractNumId="3" w15:restartNumberingAfterBreak="0">
     <w:nsid w:val="0F770AAB"/>
     <w:multiLevelType w:val="hybridMultilevel"/>
     <w:tmpl w:val="DD20C6F8"/>
@@ -1180,7 +1472,7 @@
       </w:pPr>
     </w:lvl>
   </w:abstractNum>
-  <w:abstractNum w:abstractNumId="1" w15:restartNumberingAfterBreak="0">
+  <w:abstractNum w:abstractNumId="4" w15:restartNumberingAfterBreak="0">
     <w:nsid w:val="134A37E7"/>
     <w:multiLevelType w:val="hybridMultilevel"/>
     <w:tmpl w:val="ABAEE6BC"/>
@@ -1266,7 +1558,7 @@
       </w:pPr>
     </w:lvl>
   </w:abstractNum>
-  <w:abstractNum w:abstractNumId="2" w15:restartNumberingAfterBreak="0">
+  <w:abstractNum w:abstractNumId="5" w15:restartNumberingAfterBreak="0">
     <w:nsid w:val="17293A5D"/>
     <w:multiLevelType w:val="hybridMultilevel"/>
     <w:tmpl w:val="6BD087F8"/>
@@ -1379,7 +1671,120 @@
       </w:rPr>
     </w:lvl>
   </w:abstractNum>
-  <w:abstractNum w:abstractNumId="3" w15:restartNumberingAfterBreak="0">
+  <w:abstractNum w:abstractNumId="6" w15:restartNumberingAfterBreak="0">
+    <w:nsid w:val="196F5CAA"/>
+    <w:multiLevelType w:val="multilevel"/>
+    <w:tmpl w:val="7A9E6E96"/>
+    <w:lvl w:ilvl="0">
+      <w:start w:val="2"/>
+      <w:numFmt w:val="decimal"/>
+      <w:lvlText w:val="%1."/>
+      <w:lvlJc w:val="left"/>
+      <w:pPr>
+        <w:tabs>
+          <w:tab w:val="num" w:pos="720"/>
+        </w:tabs>
+        <w:ind w:left="720" w:hanging="360"/>
+      </w:pPr>
+    </w:lvl>
+    <w:lvl w:ilvl="1" w:tentative="1">
+      <w:start w:val="1"/>
+      <w:numFmt w:val="decimal"/>
+      <w:lvlText w:val="%2."/>
+      <w:lvlJc w:val="left"/>
+      <w:pPr>
+        <w:tabs>
+          <w:tab w:val="num" w:pos="1440"/>
+        </w:tabs>
+        <w:ind w:left="1440" w:hanging="360"/>
+      </w:pPr>
+    </w:lvl>
+    <w:lvl w:ilvl="2" w:tentative="1">
+      <w:start w:val="1"/>
+      <w:numFmt w:val="decimal"/>
+      <w:lvlText w:val="%3."/>
+      <w:lvlJc w:val="left"/>
+      <w:pPr>
+        <w:tabs>
+          <w:tab w:val="num" w:pos="2160"/>
+        </w:tabs>
+        <w:ind w:left="2160" w:hanging="360"/>
+      </w:pPr>
+    </w:lvl>
+    <w:lvl w:ilvl="3" w:tentative="1">
+      <w:start w:val="1"/>
+      <w:numFmt w:val="decimal"/>
+      <w:lvlText w:val="%4."/>
+      <w:lvlJc w:val="left"/>
+      <w:pPr>
+        <w:tabs>
+          <w:tab w:val="num" w:pos="2880"/>
+        </w:tabs>
+        <w:ind w:left="2880" w:hanging="360"/>
+      </w:pPr>
+    </w:lvl>
+    <w:lvl w:ilvl="4" w:tentative="1">
+      <w:start w:val="1"/>
+      <w:numFmt w:val="decimal"/>
+      <w:lvlText w:val="%5."/>
+      <w:lvlJc w:val="left"/>
+      <w:pPr>
+        <w:tabs>
+          <w:tab w:val="num" w:pos="3600"/>
+        </w:tabs>
+        <w:ind w:left="3600" w:hanging="360"/>
+      </w:pPr>
+    </w:lvl>
+    <w:lvl w:ilvl="5" w:tentative="1">
+      <w:start w:val="1"/>
+      <w:numFmt w:val="decimal"/>
+      <w:lvlText w:val="%6."/>
+      <w:lvlJc w:val="left"/>
+      <w:pPr>
+        <w:tabs>
+          <w:tab w:val="num" w:pos="4320"/>
+        </w:tabs>
+        <w:ind w:left="4320" w:hanging="360"/>
+      </w:pPr>
+    </w:lvl>
+    <w:lvl w:ilvl="6" w:tentative="1">
+      <w:start w:val="1"/>
+      <w:numFmt w:val="decimal"/>
+      <w:lvlText w:val="%7."/>
+      <w:lvlJc w:val="left"/>
+      <w:pPr>
+        <w:tabs>
+          <w:tab w:val="num" w:pos="5040"/>
+        </w:tabs>
+        <w:ind w:left="5040" w:hanging="360"/>
+      </w:pPr>
+    </w:lvl>
+    <w:lvl w:ilvl="7" w:tentative="1">
+      <w:start w:val="1"/>
+      <w:numFmt w:val="decimal"/>
+      <w:lvlText w:val="%8."/>
+      <w:lvlJc w:val="left"/>
+      <w:pPr>
+        <w:tabs>
+          <w:tab w:val="num" w:pos="5760"/>
+        </w:tabs>
+        <w:ind w:left="5760" w:hanging="360"/>
+      </w:pPr>
+    </w:lvl>
+    <w:lvl w:ilvl="8" w:tentative="1">
+      <w:start w:val="1"/>
+      <w:numFmt w:val="decimal"/>
+      <w:lvlText w:val="%9."/>
+      <w:lvlJc w:val="left"/>
+      <w:pPr>
+        <w:tabs>
+          <w:tab w:val="num" w:pos="6480"/>
+        </w:tabs>
+        <w:ind w:left="6480" w:hanging="360"/>
+      </w:pPr>
+    </w:lvl>
+  </w:abstractNum>
+  <w:abstractNum w:abstractNumId="7" w15:restartNumberingAfterBreak="0">
     <w:nsid w:val="1C6E67C0"/>
     <w:multiLevelType w:val="hybridMultilevel"/>
     <w:tmpl w:val="05BC6536"/>
@@ -1465,7 +1870,7 @@
       </w:pPr>
     </w:lvl>
   </w:abstractNum>
-  <w:abstractNum w:abstractNumId="4" w15:restartNumberingAfterBreak="0">
+  <w:abstractNum w:abstractNumId="8" w15:restartNumberingAfterBreak="0">
     <w:nsid w:val="1E6C4149"/>
     <w:multiLevelType w:val="hybridMultilevel"/>
     <w:tmpl w:val="8FD45B20"/>
@@ -1551,11 +1956,278 @@
       </w:pPr>
     </w:lvl>
   </w:abstractNum>
-  <w:abstractNum w:abstractNumId="5" w15:restartNumberingAfterBreak="0">
+  <w:abstractNum w:abstractNumId="9" w15:restartNumberingAfterBreak="0">
+    <w:nsid w:val="29C47AD5"/>
+    <w:multiLevelType w:val="multilevel"/>
+    <w:tmpl w:val="6C7AF56A"/>
+    <w:lvl w:ilvl="0">
+      <w:start w:val="1"/>
+      <w:numFmt w:val="decimal"/>
+      <w:lvlText w:val="%1."/>
+      <w:lvlJc w:val="left"/>
+      <w:pPr>
+        <w:ind w:left="720" w:hanging="360"/>
+      </w:pPr>
+    </w:lvl>
+    <w:lvl w:ilvl="1">
+      <w:start w:val="1"/>
+      <w:numFmt w:val="decimal"/>
+      <w:isLgl/>
+      <w:lvlText w:val="%1.%2"/>
+      <w:lvlJc w:val="left"/>
+      <w:pPr>
+        <w:ind w:left="1080" w:hanging="360"/>
+      </w:pPr>
+      <w:rPr>
+        <w:rFonts w:hint="default"/>
+      </w:rPr>
+    </w:lvl>
+    <w:lvl w:ilvl="2">
+      <w:start w:val="1"/>
+      <w:numFmt w:val="decimal"/>
+      <w:isLgl/>
+      <w:lvlText w:val="%1.%2.%3"/>
+      <w:lvlJc w:val="left"/>
+      <w:pPr>
+        <w:ind w:left="1800" w:hanging="720"/>
+      </w:pPr>
+      <w:rPr>
+        <w:rFonts w:hint="default"/>
+      </w:rPr>
+    </w:lvl>
+    <w:lvl w:ilvl="3">
+      <w:start w:val="1"/>
+      <w:numFmt w:val="decimal"/>
+      <w:isLgl/>
+      <w:lvlText w:val="%1.%2.%3.%4"/>
+      <w:lvlJc w:val="left"/>
+      <w:pPr>
+        <w:ind w:left="2160" w:hanging="720"/>
+      </w:pPr>
+      <w:rPr>
+        <w:rFonts w:hint="default"/>
+      </w:rPr>
+    </w:lvl>
+    <w:lvl w:ilvl="4">
+      <w:start w:val="1"/>
+      <w:numFmt w:val="decimal"/>
+      <w:isLgl/>
+      <w:lvlText w:val="%1.%2.%3.%4.%5"/>
+      <w:lvlJc w:val="left"/>
+      <w:pPr>
+        <w:ind w:left="2880" w:hanging="1080"/>
+      </w:pPr>
+      <w:rPr>
+        <w:rFonts w:hint="default"/>
+      </w:rPr>
+    </w:lvl>
+    <w:lvl w:ilvl="5">
+      <w:start w:val="1"/>
+      <w:numFmt w:val="decimal"/>
+      <w:isLgl/>
+      <w:lvlText w:val="%1.%2.%3.%4.%5.%6"/>
+      <w:lvlJc w:val="left"/>
+      <w:pPr>
+        <w:ind w:left="3240" w:hanging="1080"/>
+      </w:pPr>
+      <w:rPr>
+        <w:rFonts w:hint="default"/>
+      </w:rPr>
+    </w:lvl>
+    <w:lvl w:ilvl="6">
+      <w:start w:val="1"/>
+      <w:numFmt w:val="decimal"/>
+      <w:isLgl/>
+      <w:lvlText w:val="%1.%2.%3.%4.%5.%6.%7"/>
+      <w:lvlJc w:val="left"/>
+      <w:pPr>
+        <w:ind w:left="3960" w:hanging="1440"/>
+      </w:pPr>
+      <w:rPr>
+        <w:rFonts w:hint="default"/>
+      </w:rPr>
+    </w:lvl>
+    <w:lvl w:ilvl="7">
+      <w:start w:val="1"/>
+      <w:numFmt w:val="decimal"/>
+      <w:isLgl/>
+      <w:lvlText w:val="%1.%2.%3.%4.%5.%6.%7.%8"/>
+      <w:lvlJc w:val="left"/>
+      <w:pPr>
+        <w:ind w:left="4320" w:hanging="1440"/>
+      </w:pPr>
+      <w:rPr>
+        <w:rFonts w:hint="default"/>
+      </w:rPr>
+    </w:lvl>
+    <w:lvl w:ilvl="8">
+      <w:start w:val="1"/>
+      <w:numFmt w:val="decimal"/>
+      <w:isLgl/>
+      <w:lvlText w:val="%1.%2.%3.%4.%5.%6.%7.%8.%9"/>
+      <w:lvlJc w:val="left"/>
+      <w:pPr>
+        <w:ind w:left="4680" w:hanging="1440"/>
+      </w:pPr>
+      <w:rPr>
+        <w:rFonts w:hint="default"/>
+      </w:rPr>
+    </w:lvl>
+  </w:abstractNum>
+  <w:abstractNum w:abstractNumId="10" w15:restartNumberingAfterBreak="0">
+    <w:nsid w:val="34A02F1B"/>
+    <w:multiLevelType w:val="multilevel"/>
+    <w:tmpl w:val="93686754"/>
+    <w:lvl w:ilvl="0">
+      <w:start w:val="1"/>
+      <w:numFmt w:val="bullet"/>
+      <w:lvlText w:val=""/>
+      <w:lvlJc w:val="left"/>
+      <w:pPr>
+        <w:tabs>
+          <w:tab w:val="num" w:pos="720"/>
+        </w:tabs>
+        <w:ind w:left="720" w:hanging="360"/>
+      </w:pPr>
+      <w:rPr>
+        <w:rFonts w:ascii="Symbol" w:hAnsi="Symbol" w:hint="default"/>
+        <w:sz w:val="20"/>
+      </w:rPr>
+    </w:lvl>
+    <w:lvl w:ilvl="1" w:tentative="1">
+      <w:start w:val="1"/>
+      <w:numFmt w:val="bullet"/>
+      <w:lvlText w:val="o"/>
+      <w:lvlJc w:val="left"/>
+      <w:pPr>
+        <w:tabs>
+          <w:tab w:val="num" w:pos="1440"/>
+        </w:tabs>
+        <w:ind w:left="1440" w:hanging="360"/>
+      </w:pPr>
+      <w:rPr>
+        <w:rFonts w:ascii="Courier New" w:hAnsi="Courier New" w:hint="default"/>
+        <w:sz w:val="20"/>
+      </w:rPr>
+    </w:lvl>
+    <w:lvl w:ilvl="2" w:tentative="1">
+      <w:start w:val="1"/>
+      <w:numFmt w:val="bullet"/>
+      <w:lvlText w:val=""/>
+      <w:lvlJc w:val="left"/>
+      <w:pPr>
+        <w:tabs>
+          <w:tab w:val="num" w:pos="2160"/>
+        </w:tabs>
+        <w:ind w:left="2160" w:hanging="360"/>
+      </w:pPr>
+      <w:rPr>
+        <w:rFonts w:ascii="Wingdings" w:hAnsi="Wingdings" w:hint="default"/>
+        <w:sz w:val="20"/>
+      </w:rPr>
+    </w:lvl>
+    <w:lvl w:ilvl="3" w:tentative="1">
+      <w:start w:val="1"/>
+      <w:numFmt w:val="bullet"/>
+      <w:lvlText w:val=""/>
+      <w:lvlJc w:val="left"/>
+      <w:pPr>
+        <w:tabs>
+          <w:tab w:val="num" w:pos="2880"/>
+        </w:tabs>
+        <w:ind w:left="2880" w:hanging="360"/>
+      </w:pPr>
+      <w:rPr>
+        <w:rFonts w:ascii="Wingdings" w:hAnsi="Wingdings" w:hint="default"/>
+        <w:sz w:val="20"/>
+      </w:rPr>
+    </w:lvl>
+    <w:lvl w:ilvl="4" w:tentative="1">
+      <w:start w:val="1"/>
+      <w:numFmt w:val="bullet"/>
+      <w:lvlText w:val=""/>
+      <w:lvlJc w:val="left"/>
+      <w:pPr>
+        <w:tabs>
+          <w:tab w:val="num" w:pos="3600"/>
+        </w:tabs>
+        <w:ind w:left="3600" w:hanging="360"/>
+      </w:pPr>
+      <w:rPr>
+        <w:rFonts w:ascii="Wingdings" w:hAnsi="Wingdings" w:hint="default"/>
+        <w:sz w:val="20"/>
+      </w:rPr>
+    </w:lvl>
+    <w:lvl w:ilvl="5" w:tentative="1">
+      <w:start w:val="1"/>
+      <w:numFmt w:val="bullet"/>
+      <w:lvlText w:val=""/>
+      <w:lvlJc w:val="left"/>
+      <w:pPr>
+        <w:tabs>
+          <w:tab w:val="num" w:pos="4320"/>
+        </w:tabs>
+        <w:ind w:left="4320" w:hanging="360"/>
+      </w:pPr>
+      <w:rPr>
+        <w:rFonts w:ascii="Wingdings" w:hAnsi="Wingdings" w:hint="default"/>
+        <w:sz w:val="20"/>
+      </w:rPr>
+    </w:lvl>
+    <w:lvl w:ilvl="6" w:tentative="1">
+      <w:start w:val="1"/>
+      <w:numFmt w:val="bullet"/>
+      <w:lvlText w:val=""/>
+      <w:lvlJc w:val="left"/>
+      <w:pPr>
+        <w:tabs>
+          <w:tab w:val="num" w:pos="5040"/>
+        </w:tabs>
+        <w:ind w:left="5040" w:hanging="360"/>
+      </w:pPr>
+      <w:rPr>
+        <w:rFonts w:ascii="Wingdings" w:hAnsi="Wingdings" w:hint="default"/>
+        <w:sz w:val="20"/>
+      </w:rPr>
+    </w:lvl>
+    <w:lvl w:ilvl="7" w:tentative="1">
+      <w:start w:val="1"/>
+      <w:numFmt w:val="bullet"/>
+      <w:lvlText w:val=""/>
+      <w:lvlJc w:val="left"/>
+      <w:pPr>
+        <w:tabs>
+          <w:tab w:val="num" w:pos="5760"/>
+        </w:tabs>
+        <w:ind w:left="5760" w:hanging="360"/>
+      </w:pPr>
+      <w:rPr>
+        <w:rFonts w:ascii="Wingdings" w:hAnsi="Wingdings" w:hint="default"/>
+        <w:sz w:val="20"/>
+      </w:rPr>
+    </w:lvl>
+    <w:lvl w:ilvl="8" w:tentative="1">
+      <w:start w:val="1"/>
+      <w:numFmt w:val="bullet"/>
+      <w:lvlText w:val=""/>
+      <w:lvlJc w:val="left"/>
+      <w:pPr>
+        <w:tabs>
+          <w:tab w:val="num" w:pos="6480"/>
+        </w:tabs>
+        <w:ind w:left="6480" w:hanging="360"/>
+      </w:pPr>
+      <w:rPr>
+        <w:rFonts w:ascii="Wingdings" w:hAnsi="Wingdings" w:hint="default"/>
+        <w:sz w:val="20"/>
+      </w:rPr>
+    </w:lvl>
+  </w:abstractNum>
+  <w:abstractNum w:abstractNumId="11" w15:restartNumberingAfterBreak="0">
     <w:nsid w:val="3F0203D8"/>
-    <w:multiLevelType w:val="hybridMultilevel"/>
-    <w:tmpl w:val="64686F08"/>
-    <w:lvl w:ilvl="0" w:tplc="580A000F">
+    <w:multiLevelType w:val="multilevel"/>
+    <w:tmpl w:val="6C7AF56A"/>
+    <w:lvl w:ilvl="0">
       <w:start w:val="1"/>
       <w:numFmt w:val="decimal"/>
       <w:lvlText w:val="%1."/>
@@ -1564,80 +2236,261 @@
         <w:ind w:left="720" w:hanging="360"/>
       </w:pPr>
     </w:lvl>
-    <w:lvl w:ilvl="1" w:tplc="580A0019" w:tentative="1">
-      <w:start w:val="1"/>
-      <w:numFmt w:val="lowerLetter"/>
-      <w:lvlText w:val="%2."/>
-      <w:lvlJc w:val="left"/>
-      <w:pPr>
+    <w:lvl w:ilvl="1">
+      <w:start w:val="1"/>
+      <w:numFmt w:val="decimal"/>
+      <w:isLgl/>
+      <w:lvlText w:val="%1.%2"/>
+      <w:lvlJc w:val="left"/>
+      <w:pPr>
+        <w:ind w:left="1080" w:hanging="360"/>
+      </w:pPr>
+      <w:rPr>
+        <w:rFonts w:hint="default"/>
+      </w:rPr>
+    </w:lvl>
+    <w:lvl w:ilvl="2">
+      <w:start w:val="1"/>
+      <w:numFmt w:val="decimal"/>
+      <w:isLgl/>
+      <w:lvlText w:val="%1.%2.%3"/>
+      <w:lvlJc w:val="left"/>
+      <w:pPr>
+        <w:ind w:left="1800" w:hanging="720"/>
+      </w:pPr>
+      <w:rPr>
+        <w:rFonts w:hint="default"/>
+      </w:rPr>
+    </w:lvl>
+    <w:lvl w:ilvl="3">
+      <w:start w:val="1"/>
+      <w:numFmt w:val="decimal"/>
+      <w:isLgl/>
+      <w:lvlText w:val="%1.%2.%3.%4"/>
+      <w:lvlJc w:val="left"/>
+      <w:pPr>
+        <w:ind w:left="2160" w:hanging="720"/>
+      </w:pPr>
+      <w:rPr>
+        <w:rFonts w:hint="default"/>
+      </w:rPr>
+    </w:lvl>
+    <w:lvl w:ilvl="4">
+      <w:start w:val="1"/>
+      <w:numFmt w:val="decimal"/>
+      <w:isLgl/>
+      <w:lvlText w:val="%1.%2.%3.%4.%5"/>
+      <w:lvlJc w:val="left"/>
+      <w:pPr>
+        <w:ind w:left="2880" w:hanging="1080"/>
+      </w:pPr>
+      <w:rPr>
+        <w:rFonts w:hint="default"/>
+      </w:rPr>
+    </w:lvl>
+    <w:lvl w:ilvl="5">
+      <w:start w:val="1"/>
+      <w:numFmt w:val="decimal"/>
+      <w:isLgl/>
+      <w:lvlText w:val="%1.%2.%3.%4.%5.%6"/>
+      <w:lvlJc w:val="left"/>
+      <w:pPr>
+        <w:ind w:left="3240" w:hanging="1080"/>
+      </w:pPr>
+      <w:rPr>
+        <w:rFonts w:hint="default"/>
+      </w:rPr>
+    </w:lvl>
+    <w:lvl w:ilvl="6">
+      <w:start w:val="1"/>
+      <w:numFmt w:val="decimal"/>
+      <w:isLgl/>
+      <w:lvlText w:val="%1.%2.%3.%4.%5.%6.%7"/>
+      <w:lvlJc w:val="left"/>
+      <w:pPr>
+        <w:ind w:left="3960" w:hanging="1440"/>
+      </w:pPr>
+      <w:rPr>
+        <w:rFonts w:hint="default"/>
+      </w:rPr>
+    </w:lvl>
+    <w:lvl w:ilvl="7">
+      <w:start w:val="1"/>
+      <w:numFmt w:val="decimal"/>
+      <w:isLgl/>
+      <w:lvlText w:val="%1.%2.%3.%4.%5.%6.%7.%8"/>
+      <w:lvlJc w:val="left"/>
+      <w:pPr>
+        <w:ind w:left="4320" w:hanging="1440"/>
+      </w:pPr>
+      <w:rPr>
+        <w:rFonts w:hint="default"/>
+      </w:rPr>
+    </w:lvl>
+    <w:lvl w:ilvl="8">
+      <w:start w:val="1"/>
+      <w:numFmt w:val="decimal"/>
+      <w:isLgl/>
+      <w:lvlText w:val="%1.%2.%3.%4.%5.%6.%7.%8.%9"/>
+      <w:lvlJc w:val="left"/>
+      <w:pPr>
+        <w:ind w:left="4680" w:hanging="1440"/>
+      </w:pPr>
+      <w:rPr>
+        <w:rFonts w:hint="default"/>
+      </w:rPr>
+    </w:lvl>
+  </w:abstractNum>
+  <w:abstractNum w:abstractNumId="12" w15:restartNumberingAfterBreak="0">
+    <w:nsid w:val="3F4626A3"/>
+    <w:multiLevelType w:val="multilevel"/>
+    <w:tmpl w:val="D4ECFA40"/>
+    <w:lvl w:ilvl="0">
+      <w:start w:val="1"/>
+      <w:numFmt w:val="bullet"/>
+      <w:lvlText w:val=""/>
+      <w:lvlJc w:val="left"/>
+      <w:pPr>
+        <w:tabs>
+          <w:tab w:val="num" w:pos="720"/>
+        </w:tabs>
+        <w:ind w:left="720" w:hanging="360"/>
+      </w:pPr>
+      <w:rPr>
+        <w:rFonts w:ascii="Symbol" w:hAnsi="Symbol" w:hint="default"/>
+        <w:sz w:val="20"/>
+      </w:rPr>
+    </w:lvl>
+    <w:lvl w:ilvl="1" w:tentative="1">
+      <w:start w:val="1"/>
+      <w:numFmt w:val="bullet"/>
+      <w:lvlText w:val="o"/>
+      <w:lvlJc w:val="left"/>
+      <w:pPr>
+        <w:tabs>
+          <w:tab w:val="num" w:pos="1440"/>
+        </w:tabs>
         <w:ind w:left="1440" w:hanging="360"/>
       </w:pPr>
-    </w:lvl>
-    <w:lvl w:ilvl="2" w:tplc="580A001B" w:tentative="1">
-      <w:start w:val="1"/>
-      <w:numFmt w:val="lowerRoman"/>
-      <w:lvlText w:val="%3."/>
-      <w:lvlJc w:val="right"/>
-      <w:pPr>
-        <w:ind w:left="2160" w:hanging="180"/>
-      </w:pPr>
-    </w:lvl>
-    <w:lvl w:ilvl="3" w:tplc="580A000F" w:tentative="1">
-      <w:start w:val="1"/>
-      <w:numFmt w:val="decimal"/>
-      <w:lvlText w:val="%4."/>
-      <w:lvlJc w:val="left"/>
-      <w:pPr>
+      <w:rPr>
+        <w:rFonts w:ascii="Courier New" w:hAnsi="Courier New" w:hint="default"/>
+        <w:sz w:val="20"/>
+      </w:rPr>
+    </w:lvl>
+    <w:lvl w:ilvl="2" w:tentative="1">
+      <w:start w:val="1"/>
+      <w:numFmt w:val="bullet"/>
+      <w:lvlText w:val=""/>
+      <w:lvlJc w:val="left"/>
+      <w:pPr>
+        <w:tabs>
+          <w:tab w:val="num" w:pos="2160"/>
+        </w:tabs>
+        <w:ind w:left="2160" w:hanging="360"/>
+      </w:pPr>
+      <w:rPr>
+        <w:rFonts w:ascii="Wingdings" w:hAnsi="Wingdings" w:hint="default"/>
+        <w:sz w:val="20"/>
+      </w:rPr>
+    </w:lvl>
+    <w:lvl w:ilvl="3" w:tentative="1">
+      <w:start w:val="1"/>
+      <w:numFmt w:val="bullet"/>
+      <w:lvlText w:val=""/>
+      <w:lvlJc w:val="left"/>
+      <w:pPr>
+        <w:tabs>
+          <w:tab w:val="num" w:pos="2880"/>
+        </w:tabs>
         <w:ind w:left="2880" w:hanging="360"/>
       </w:pPr>
-    </w:lvl>
-    <w:lvl w:ilvl="4" w:tplc="580A0019" w:tentative="1">
-      <w:start w:val="1"/>
-      <w:numFmt w:val="lowerLetter"/>
-      <w:lvlText w:val="%5."/>
-      <w:lvlJc w:val="left"/>
-      <w:pPr>
+      <w:rPr>
+        <w:rFonts w:ascii="Wingdings" w:hAnsi="Wingdings" w:hint="default"/>
+        <w:sz w:val="20"/>
+      </w:rPr>
+    </w:lvl>
+    <w:lvl w:ilvl="4" w:tentative="1">
+      <w:start w:val="1"/>
+      <w:numFmt w:val="bullet"/>
+      <w:lvlText w:val=""/>
+      <w:lvlJc w:val="left"/>
+      <w:pPr>
+        <w:tabs>
+          <w:tab w:val="num" w:pos="3600"/>
+        </w:tabs>
         <w:ind w:left="3600" w:hanging="360"/>
       </w:pPr>
-    </w:lvl>
-    <w:lvl w:ilvl="5" w:tplc="580A001B" w:tentative="1">
-      <w:start w:val="1"/>
-      <w:numFmt w:val="lowerRoman"/>
-      <w:lvlText w:val="%6."/>
-      <w:lvlJc w:val="right"/>
-      <w:pPr>
-        <w:ind w:left="4320" w:hanging="180"/>
-      </w:pPr>
-    </w:lvl>
-    <w:lvl w:ilvl="6" w:tplc="580A000F" w:tentative="1">
-      <w:start w:val="1"/>
-      <w:numFmt w:val="decimal"/>
-      <w:lvlText w:val="%7."/>
-      <w:lvlJc w:val="left"/>
-      <w:pPr>
+      <w:rPr>
+        <w:rFonts w:ascii="Wingdings" w:hAnsi="Wingdings" w:hint="default"/>
+        <w:sz w:val="20"/>
+      </w:rPr>
+    </w:lvl>
+    <w:lvl w:ilvl="5" w:tentative="1">
+      <w:start w:val="1"/>
+      <w:numFmt w:val="bullet"/>
+      <w:lvlText w:val=""/>
+      <w:lvlJc w:val="left"/>
+      <w:pPr>
+        <w:tabs>
+          <w:tab w:val="num" w:pos="4320"/>
+        </w:tabs>
+        <w:ind w:left="4320" w:hanging="360"/>
+      </w:pPr>
+      <w:rPr>
+        <w:rFonts w:ascii="Wingdings" w:hAnsi="Wingdings" w:hint="default"/>
+        <w:sz w:val="20"/>
+      </w:rPr>
+    </w:lvl>
+    <w:lvl w:ilvl="6" w:tentative="1">
+      <w:start w:val="1"/>
+      <w:numFmt w:val="bullet"/>
+      <w:lvlText w:val=""/>
+      <w:lvlJc w:val="left"/>
+      <w:pPr>
+        <w:tabs>
+          <w:tab w:val="num" w:pos="5040"/>
+        </w:tabs>
         <w:ind w:left="5040" w:hanging="360"/>
       </w:pPr>
-    </w:lvl>
-    <w:lvl w:ilvl="7" w:tplc="580A0019" w:tentative="1">
-      <w:start w:val="1"/>
-      <w:numFmt w:val="lowerLetter"/>
-      <w:lvlText w:val="%8."/>
-      <w:lvlJc w:val="left"/>
-      <w:pPr>
+      <w:rPr>
+        <w:rFonts w:ascii="Wingdings" w:hAnsi="Wingdings" w:hint="default"/>
+        <w:sz w:val="20"/>
+      </w:rPr>
+    </w:lvl>
+    <w:lvl w:ilvl="7" w:tentative="1">
+      <w:start w:val="1"/>
+      <w:numFmt w:val="bullet"/>
+      <w:lvlText w:val=""/>
+      <w:lvlJc w:val="left"/>
+      <w:pPr>
+        <w:tabs>
+          <w:tab w:val="num" w:pos="5760"/>
+        </w:tabs>
         <w:ind w:left="5760" w:hanging="360"/>
       </w:pPr>
-    </w:lvl>
-    <w:lvl w:ilvl="8" w:tplc="580A001B" w:tentative="1">
-      <w:start w:val="1"/>
-      <w:numFmt w:val="lowerRoman"/>
-      <w:lvlText w:val="%9."/>
-      <w:lvlJc w:val="right"/>
-      <w:pPr>
-        <w:ind w:left="6480" w:hanging="180"/>
-      </w:pPr>
+      <w:rPr>
+        <w:rFonts w:ascii="Wingdings" w:hAnsi="Wingdings" w:hint="default"/>
+        <w:sz w:val="20"/>
+      </w:rPr>
+    </w:lvl>
+    <w:lvl w:ilvl="8" w:tentative="1">
+      <w:start w:val="1"/>
+      <w:numFmt w:val="bullet"/>
+      <w:lvlText w:val=""/>
+      <w:lvlJc w:val="left"/>
+      <w:pPr>
+        <w:tabs>
+          <w:tab w:val="num" w:pos="6480"/>
+        </w:tabs>
+        <w:ind w:left="6480" w:hanging="360"/>
+      </w:pPr>
+      <w:rPr>
+        <w:rFonts w:ascii="Wingdings" w:hAnsi="Wingdings" w:hint="default"/>
+        <w:sz w:val="20"/>
+      </w:rPr>
     </w:lvl>
   </w:abstractNum>
-  <w:abstractNum w:abstractNumId="6" w15:restartNumberingAfterBreak="0">
+  <w:abstractNum w:abstractNumId="13" w15:restartNumberingAfterBreak="0">
     <w:nsid w:val="40374823"/>
     <w:multiLevelType w:val="hybridMultilevel"/>
     <w:tmpl w:val="5312431E"/>
@@ -1750,10 +2603,123 @@
       </w:rPr>
     </w:lvl>
   </w:abstractNum>
-  <w:abstractNum w:abstractNumId="7" w15:restartNumberingAfterBreak="0">
+  <w:abstractNum w:abstractNumId="14" w15:restartNumberingAfterBreak="0">
+    <w:nsid w:val="4D515D1F"/>
+    <w:multiLevelType w:val="multilevel"/>
+    <w:tmpl w:val="6304143C"/>
+    <w:lvl w:ilvl="0">
+      <w:start w:val="1"/>
+      <w:numFmt w:val="decimal"/>
+      <w:lvlText w:val="%1."/>
+      <w:lvlJc w:val="left"/>
+      <w:pPr>
+        <w:tabs>
+          <w:tab w:val="num" w:pos="720"/>
+        </w:tabs>
+        <w:ind w:left="720" w:hanging="360"/>
+      </w:pPr>
+    </w:lvl>
+    <w:lvl w:ilvl="1" w:tentative="1">
+      <w:start w:val="1"/>
+      <w:numFmt w:val="decimal"/>
+      <w:lvlText w:val="%2."/>
+      <w:lvlJc w:val="left"/>
+      <w:pPr>
+        <w:tabs>
+          <w:tab w:val="num" w:pos="1440"/>
+        </w:tabs>
+        <w:ind w:left="1440" w:hanging="360"/>
+      </w:pPr>
+    </w:lvl>
+    <w:lvl w:ilvl="2" w:tentative="1">
+      <w:start w:val="1"/>
+      <w:numFmt w:val="decimal"/>
+      <w:lvlText w:val="%3."/>
+      <w:lvlJc w:val="left"/>
+      <w:pPr>
+        <w:tabs>
+          <w:tab w:val="num" w:pos="2160"/>
+        </w:tabs>
+        <w:ind w:left="2160" w:hanging="360"/>
+      </w:pPr>
+    </w:lvl>
+    <w:lvl w:ilvl="3" w:tentative="1">
+      <w:start w:val="1"/>
+      <w:numFmt w:val="decimal"/>
+      <w:lvlText w:val="%4."/>
+      <w:lvlJc w:val="left"/>
+      <w:pPr>
+        <w:tabs>
+          <w:tab w:val="num" w:pos="2880"/>
+        </w:tabs>
+        <w:ind w:left="2880" w:hanging="360"/>
+      </w:pPr>
+    </w:lvl>
+    <w:lvl w:ilvl="4" w:tentative="1">
+      <w:start w:val="1"/>
+      <w:numFmt w:val="decimal"/>
+      <w:lvlText w:val="%5."/>
+      <w:lvlJc w:val="left"/>
+      <w:pPr>
+        <w:tabs>
+          <w:tab w:val="num" w:pos="3600"/>
+        </w:tabs>
+        <w:ind w:left="3600" w:hanging="360"/>
+      </w:pPr>
+    </w:lvl>
+    <w:lvl w:ilvl="5" w:tentative="1">
+      <w:start w:val="1"/>
+      <w:numFmt w:val="decimal"/>
+      <w:lvlText w:val="%6."/>
+      <w:lvlJc w:val="left"/>
+      <w:pPr>
+        <w:tabs>
+          <w:tab w:val="num" w:pos="4320"/>
+        </w:tabs>
+        <w:ind w:left="4320" w:hanging="360"/>
+      </w:pPr>
+    </w:lvl>
+    <w:lvl w:ilvl="6" w:tentative="1">
+      <w:start w:val="1"/>
+      <w:numFmt w:val="decimal"/>
+      <w:lvlText w:val="%7."/>
+      <w:lvlJc w:val="left"/>
+      <w:pPr>
+        <w:tabs>
+          <w:tab w:val="num" w:pos="5040"/>
+        </w:tabs>
+        <w:ind w:left="5040" w:hanging="360"/>
+      </w:pPr>
+    </w:lvl>
+    <w:lvl w:ilvl="7" w:tentative="1">
+      <w:start w:val="1"/>
+      <w:numFmt w:val="decimal"/>
+      <w:lvlText w:val="%8."/>
+      <w:lvlJc w:val="left"/>
+      <w:pPr>
+        <w:tabs>
+          <w:tab w:val="num" w:pos="5760"/>
+        </w:tabs>
+        <w:ind w:left="5760" w:hanging="360"/>
+      </w:pPr>
+    </w:lvl>
+    <w:lvl w:ilvl="8" w:tentative="1">
+      <w:start w:val="1"/>
+      <w:numFmt w:val="decimal"/>
+      <w:lvlText w:val="%9."/>
+      <w:lvlJc w:val="left"/>
+      <w:pPr>
+        <w:tabs>
+          <w:tab w:val="num" w:pos="6480"/>
+        </w:tabs>
+        <w:ind w:left="6480" w:hanging="360"/>
+      </w:pPr>
+    </w:lvl>
+  </w:abstractNum>
+  <w:abstractNum w:abstractNumId="15" w15:restartNumberingAfterBreak="0">
     <w:nsid w:val="62BD33D2"/>
     <w:multiLevelType w:val="hybridMultilevel"/>
-    <w:tmpl w:val="6E3C7DDC"/>
+    <w:tmpl w:val="F70C4080"/>
     <w:lvl w:ilvl="0" w:tplc="580A0001">
       <w:start w:val="1"/>
       <w:numFmt w:val="bullet"/>
@@ -1766,7 +2732,7 @@
         <w:rFonts w:ascii="Symbol" w:hAnsi="Symbol" w:hint="default"/>
       </w:rPr>
     </w:lvl>
-    <w:lvl w:ilvl="1" w:tplc="580A0003" w:tentative="1">
+    <w:lvl w:ilvl="1" w:tplc="580A0003">
       <w:start w:val="1"/>
       <w:numFmt w:val="bullet"/>
       <w:lvlText w:val="o"/>
@@ -1863,7 +2829,243 @@
       </w:rPr>
     </w:lvl>
   </w:abstractNum>
-  <w:abstractNum w:abstractNumId="8" w15:restartNumberingAfterBreak="0">
+  <w:abstractNum w:abstractNumId="16" w15:restartNumberingAfterBreak="0">
+    <w:nsid w:val="713C6C1D"/>
+    <w:multiLevelType w:val="multilevel"/>
+    <w:tmpl w:val="6C7AF56A"/>
+    <w:lvl w:ilvl="0">
+      <w:start w:val="1"/>
+      <w:numFmt w:val="decimal"/>
+      <w:lvlText w:val="%1."/>
+      <w:lvlJc w:val="left"/>
+      <w:pPr>
+        <w:ind w:left="720" w:hanging="360"/>
+      </w:pPr>
+    </w:lvl>
+    <w:lvl w:ilvl="1">
+      <w:start w:val="1"/>
+      <w:numFmt w:val="decimal"/>
+      <w:isLgl/>
+      <w:lvlText w:val="%1.%2"/>
+      <w:lvlJc w:val="left"/>
+      <w:pPr>
+        <w:ind w:left="1080" w:hanging="360"/>
+      </w:pPr>
+      <w:rPr>
+        <w:rFonts w:hint="default"/>
+      </w:rPr>
+    </w:lvl>
+    <w:lvl w:ilvl="2">
+      <w:start w:val="1"/>
+      <w:numFmt w:val="decimal"/>
+      <w:isLgl/>
+      <w:lvlText w:val="%1.%2.%3"/>
+      <w:lvlJc w:val="left"/>
+      <w:pPr>
+        <w:ind w:left="1800" w:hanging="720"/>
+      </w:pPr>
+      <w:rPr>
+        <w:rFonts w:hint="default"/>
+      </w:rPr>
+    </w:lvl>
+    <w:lvl w:ilvl="3">
+      <w:start w:val="1"/>
+      <w:numFmt w:val="decimal"/>
+      <w:isLgl/>
+      <w:lvlText w:val="%1.%2.%3.%4"/>
+      <w:lvlJc w:val="left"/>
+      <w:pPr>
+        <w:ind w:left="2160" w:hanging="720"/>
+      </w:pPr>
+      <w:rPr>
+        <w:rFonts w:hint="default"/>
+      </w:rPr>
+    </w:lvl>
+    <w:lvl w:ilvl="4">
+      <w:start w:val="1"/>
+      <w:numFmt w:val="decimal"/>
+      <w:isLgl/>
+      <w:lvlText w:val="%1.%2.%3.%4.%5"/>
+      <w:lvlJc w:val="left"/>
+      <w:pPr>
+        <w:ind w:left="2880" w:hanging="1080"/>
+      </w:pPr>
+      <w:rPr>
+        <w:rFonts w:hint="default"/>
+      </w:rPr>
+    </w:lvl>
+    <w:lvl w:ilvl="5">
+      <w:start w:val="1"/>
+      <w:numFmt w:val="decimal"/>
+      <w:isLgl/>
+      <w:lvlText w:val="%1.%2.%3.%4.%5.%6"/>
+      <w:lvlJc w:val="left"/>
+      <w:pPr>
+        <w:ind w:left="3240" w:hanging="1080"/>
+      </w:pPr>
+      <w:rPr>
+        <w:rFonts w:hint="default"/>
+      </w:rPr>
+    </w:lvl>
+    <w:lvl w:ilvl="6">
+      <w:start w:val="1"/>
+      <w:numFmt w:val="decimal"/>
+      <w:isLgl/>
+      <w:lvlText w:val="%1.%2.%3.%4.%5.%6.%7"/>
+      <w:lvlJc w:val="left"/>
+      <w:pPr>
+        <w:ind w:left="3960" w:hanging="1440"/>
+      </w:pPr>
+      <w:rPr>
+        <w:rFonts w:hint="default"/>
+      </w:rPr>
+    </w:lvl>
+    <w:lvl w:ilvl="7">
+      <w:start w:val="1"/>
+      <w:numFmt w:val="decimal"/>
+      <w:isLgl/>
+      <w:lvlText w:val="%1.%2.%3.%4.%5.%6.%7.%8"/>
+      <w:lvlJc w:val="left"/>
+      <w:pPr>
+        <w:ind w:left="4320" w:hanging="1440"/>
+      </w:pPr>
+      <w:rPr>
+        <w:rFonts w:hint="default"/>
+      </w:rPr>
+    </w:lvl>
+    <w:lvl w:ilvl="8">
+      <w:start w:val="1"/>
+      <w:numFmt w:val="decimal"/>
+      <w:isLgl/>
+      <w:lvlText w:val="%1.%2.%3.%4.%5.%6.%7.%8.%9"/>
+      <w:lvlJc w:val="left"/>
+      <w:pPr>
+        <w:ind w:left="4680" w:hanging="1440"/>
+      </w:pPr>
+      <w:rPr>
+        <w:rFonts w:hint="default"/>
+      </w:rPr>
+    </w:lvl>
+  </w:abstractNum>
+  <w:abstractNum w:abstractNumId="17" w15:restartNumberingAfterBreak="0">
+    <w:nsid w:val="71E10F84"/>
+    <w:multiLevelType w:val="multilevel"/>
+    <w:tmpl w:val="6C7AF56A"/>
+    <w:lvl w:ilvl="0">
+      <w:start w:val="1"/>
+      <w:numFmt w:val="decimal"/>
+      <w:lvlText w:val="%1."/>
+      <w:lvlJc w:val="left"/>
+      <w:pPr>
+        <w:ind w:left="720" w:hanging="360"/>
+      </w:pPr>
+    </w:lvl>
+    <w:lvl w:ilvl="1">
+      <w:start w:val="1"/>
+      <w:numFmt w:val="decimal"/>
+      <w:isLgl/>
+      <w:lvlText w:val="%1.%2"/>
+      <w:lvlJc w:val="left"/>
+      <w:pPr>
+        <w:ind w:left="1080" w:hanging="360"/>
+      </w:pPr>
+      <w:rPr>
+        <w:rFonts w:hint="default"/>
+      </w:rPr>
+    </w:lvl>
+    <w:lvl w:ilvl="2">
+      <w:start w:val="1"/>
+      <w:numFmt w:val="decimal"/>
+      <w:isLgl/>
+      <w:lvlText w:val="%1.%2.%3"/>
+      <w:lvlJc w:val="left"/>
+      <w:pPr>
+        <w:ind w:left="1800" w:hanging="720"/>
+      </w:pPr>
+      <w:rPr>
+        <w:rFonts w:hint="default"/>
+      </w:rPr>
+    </w:lvl>
+    <w:lvl w:ilvl="3">
+      <w:start w:val="1"/>
+      <w:numFmt w:val="decimal"/>
+      <w:isLgl/>
+      <w:lvlText w:val="%1.%2.%3.%4"/>
+      <w:lvlJc w:val="left"/>
+      <w:pPr>
+        <w:ind w:left="2160" w:hanging="720"/>
+      </w:pPr>
+      <w:rPr>
+        <w:rFonts w:hint="default"/>
+      </w:rPr>
+    </w:lvl>
+    <w:lvl w:ilvl="4">
+      <w:start w:val="1"/>
+      <w:numFmt w:val="decimal"/>
+      <w:isLgl/>
+      <w:lvlText w:val="%1.%2.%3.%4.%5"/>
+      <w:lvlJc w:val="left"/>
+      <w:pPr>
+        <w:ind w:left="2880" w:hanging="1080"/>
+      </w:pPr>
+      <w:rPr>
+        <w:rFonts w:hint="default"/>
+      </w:rPr>
+    </w:lvl>
+    <w:lvl w:ilvl="5">
+      <w:start w:val="1"/>
+      <w:numFmt w:val="decimal"/>
+      <w:isLgl/>
+      <w:lvlText w:val="%1.%2.%3.%4.%5.%6"/>
+      <w:lvlJc w:val="left"/>
+      <w:pPr>
+        <w:ind w:left="3240" w:hanging="1080"/>
+      </w:pPr>
+      <w:rPr>
+        <w:rFonts w:hint="default"/>
+      </w:rPr>
+    </w:lvl>
+    <w:lvl w:ilvl="6">
+      <w:start w:val="1"/>
+      <w:numFmt w:val="decimal"/>
+      <w:isLgl/>
+      <w:lvlText w:val="%1.%2.%3.%4.%5.%6.%7"/>
+      <w:lvlJc w:val="left"/>
+      <w:pPr>
+        <w:ind w:left="3960" w:hanging="1440"/>
+      </w:pPr>
+      <w:rPr>
+        <w:rFonts w:hint="default"/>
+      </w:rPr>
+    </w:lvl>
+    <w:lvl w:ilvl="7">
+      <w:start w:val="1"/>
+      <w:numFmt w:val="decimal"/>
+      <w:isLgl/>
+      <w:lvlText w:val="%1.%2.%3.%4.%5.%6.%7.%8"/>
+      <w:lvlJc w:val="left"/>
+      <w:pPr>
+        <w:ind w:left="4320" w:hanging="1440"/>
+      </w:pPr>
+      <w:rPr>
+        <w:rFonts w:hint="default"/>
+      </w:rPr>
+    </w:lvl>
+    <w:lvl w:ilvl="8">
+      <w:start w:val="1"/>
+      <w:numFmt w:val="decimal"/>
+      <w:isLgl/>
+      <w:lvlText w:val="%1.%2.%3.%4.%5.%6.%7.%8.%9"/>
+      <w:lvlJc w:val="left"/>
+      <w:pPr>
+        <w:ind w:left="4680" w:hanging="1440"/>
+      </w:pPr>
+      <w:rPr>
+        <w:rFonts w:hint="default"/>
+      </w:rPr>
+    </w:lvl>
+  </w:abstractNum>
+  <w:abstractNum w:abstractNumId="18" w15:restartNumberingAfterBreak="0">
     <w:nsid w:val="7606263E"/>
     <w:multiLevelType w:val="hybridMultilevel"/>
     <w:tmpl w:val="AF2E0DA4"/>
@@ -1950,31 +3152,61 @@
     </w:lvl>
   </w:abstractNum>
   <w:num w:numId="1" w16cid:durableId="27949383">
+    <w:abstractNumId w:val="15"/>
+  </w:num>
+  <w:num w:numId="2" w16cid:durableId="1889415826">
+    <w:abstractNumId w:val="13"/>
+  </w:num>
+  <w:num w:numId="3" w16cid:durableId="1621642645">
+    <w:abstractNumId w:val="5"/>
+  </w:num>
+  <w:num w:numId="4" w16cid:durableId="1668316139">
+    <w:abstractNumId w:val="11"/>
+  </w:num>
+  <w:num w:numId="5" w16cid:durableId="899905577">
     <w:abstractNumId w:val="7"/>
   </w:num>
-  <w:num w:numId="2" w16cid:durableId="1889415826">
+  <w:num w:numId="6" w16cid:durableId="1364552994">
+    <w:abstractNumId w:val="3"/>
+  </w:num>
+  <w:num w:numId="7" w16cid:durableId="398478414">
+    <w:abstractNumId w:val="4"/>
+  </w:num>
+  <w:num w:numId="8" w16cid:durableId="281811216">
+    <w:abstractNumId w:val="8"/>
+  </w:num>
+  <w:num w:numId="9" w16cid:durableId="331488046">
+    <w:abstractNumId w:val="18"/>
+  </w:num>
+  <w:num w:numId="10" w16cid:durableId="401752697">
+    <w:abstractNumId w:val="14"/>
+  </w:num>
+  <w:num w:numId="11" w16cid:durableId="1429740366">
+    <w:abstractNumId w:val="10"/>
+  </w:num>
+  <w:num w:numId="12" w16cid:durableId="596908851">
     <w:abstractNumId w:val="6"/>
   </w:num>
-  <w:num w:numId="3" w16cid:durableId="1621642645">
+  <w:num w:numId="13" w16cid:durableId="880940116">
+    <w:abstractNumId w:val="12"/>
+  </w:num>
+  <w:num w:numId="14" w16cid:durableId="244072962">
+    <w:abstractNumId w:val="0"/>
+  </w:num>
+  <w:num w:numId="15" w16cid:durableId="299656729">
     <w:abstractNumId w:val="2"/>
   </w:num>
-  <w:num w:numId="4" w16cid:durableId="1668316139">
-    <w:abstractNumId w:val="5"/>
-  </w:num>
-  <w:num w:numId="5" w16cid:durableId="899905577">
-    <w:abstractNumId w:val="3"/>
-  </w:num>
-  <w:num w:numId="6" w16cid:durableId="1364552994">
-    <w:abstractNumId w:val="0"/>
-  </w:num>
-  <w:num w:numId="7" w16cid:durableId="398478414">
+  <w:num w:numId="16" w16cid:durableId="273288919">
     <w:abstractNumId w:val="1"/>
   </w:num>
-  <w:num w:numId="8" w16cid:durableId="281811216">
-    <w:abstractNumId w:val="4"/>
+  <w:num w:numId="17" w16cid:durableId="1902789304">
+    <w:abstractNumId w:val="17"/>
   </w:num>
-  <w:num w:numId="9" w16cid:durableId="331488046">
-    <w:abstractNumId w:val="8"/>
+  <w:num w:numId="18" w16cid:durableId="222327637">
+    <w:abstractNumId w:val="9"/>
+  </w:num>
+  <w:num w:numId="19" w16cid:durableId="1664778228">
+    <w:abstractNumId w:val="16"/>
   </w:num>
 </w:numbering>
 </file>
@@ -2422,6 +3654,28 @@
       <w:szCs w:val="26"/>
     </w:rPr>
   </w:style>
+  <w:style w:type="paragraph" w:styleId="Ttulo3">
+    <w:name w:val="heading 3"/>
+    <w:basedOn w:val="Normal"/>
+    <w:next w:val="Normal"/>
+    <w:link w:val="Ttulo3Car"/>
+    <w:uiPriority w:val="9"/>
+    <w:unhideWhenUsed/>
+    <w:qFormat/>
+    <w:rsid w:val="00211E07"/>
+    <w:pPr>
+      <w:keepNext/>
+      <w:keepLines/>
+      <w:spacing w:before="40" w:after="0"/>
+      <w:outlineLvl w:val="2"/>
+    </w:pPr>
+    <w:rPr>
+      <w:rFonts w:asciiTheme="majorHAnsi" w:eastAsiaTheme="majorEastAsia" w:hAnsiTheme="majorHAnsi" w:cstheme="majorBidi"/>
+      <w:color w:val="1F3763" w:themeColor="accent1" w:themeShade="7F"/>
+      <w:sz w:val="24"/>
+      <w:szCs w:val="24"/>
+    </w:rPr>
+  </w:style>
   <w:style w:type="character" w:default="1" w:styleId="Fuentedeprrafopredeter">
     <w:name w:val="Default Paragraph Font"/>
     <w:uiPriority w:val="1"/>
@@ -2518,6 +3772,19 @@
       <w:color w:val="2F5496" w:themeColor="accent1" w:themeShade="BF"/>
       <w:sz w:val="26"/>
       <w:szCs w:val="26"/>
+    </w:rPr>
+  </w:style>
+  <w:style w:type="character" w:customStyle="1" w:styleId="Ttulo3Car">
+    <w:name w:val="Título 3 Car"/>
+    <w:basedOn w:val="Fuentedeprrafopredeter"/>
+    <w:link w:val="Ttulo3"/>
+    <w:uiPriority w:val="9"/>
+    <w:rsid w:val="00211E07"/>
+    <w:rPr>
+      <w:rFonts w:asciiTheme="majorHAnsi" w:eastAsiaTheme="majorEastAsia" w:hAnsiTheme="majorHAnsi" w:cstheme="majorBidi"/>
+      <w:color w:val="1F3763" w:themeColor="accent1" w:themeShade="7F"/>
+      <w:sz w:val="24"/>
+      <w:szCs w:val="24"/>
     </w:rPr>
   </w:style>
 </w:styles>

</xml_diff>

<commit_message>
Feat: finish the SRS document first rev. -Contains information about what do I want with the project, what the app should be able to do when finished, what do I expect about it, what programs, technologies & languages will I use -Now I`ll move on to define, design and create an MVP for the project, so I can create and see how all this works out together
</commit_message>
<xml_diff>
--- a/Documento de Especificación de Requisitos.docx
+++ b/Documento de Especificación de Requisitos.docx
@@ -12,6 +12,40 @@
       </w:r>
     </w:p>
     <w:p/>
+    <w:p>
+      <w:pPr>
+        <w:pStyle w:val="Subttulo"/>
+        <w:jc w:val="center"/>
+        <w:rPr>
+          <w:sz w:val="20"/>
+          <w:szCs w:val="20"/>
+        </w:rPr>
+      </w:pPr>
+      <w:r>
+        <w:rPr>
+          <w:sz w:val="20"/>
+          <w:szCs w:val="20"/>
+        </w:rPr>
+        <w:t>Documento de Especificación de Requisitos (primera revisión)</w:t>
+      </w:r>
+    </w:p>
+    <w:p>
+      <w:pPr>
+        <w:pStyle w:val="Subttulo"/>
+        <w:jc w:val="center"/>
+        <w:rPr>
+          <w:sz w:val="20"/>
+          <w:szCs w:val="20"/>
+        </w:rPr>
+      </w:pPr>
+      <w:r>
+        <w:rPr>
+          <w:sz w:val="20"/>
+          <w:szCs w:val="20"/>
+        </w:rPr>
+        <w:t>Los contenidos aquí presentes están sujetos a cambios futuros</w:t>
+      </w:r>
+    </w:p>
     <w:p/>
     <w:p/>
     <w:p>
@@ -144,6 +178,30 @@
       <w:pPr>
         <w:pStyle w:val="Ttulo1"/>
       </w:pPr>
+    </w:p>
+    <w:p/>
+    <w:p/>
+    <w:p/>
+    <w:p/>
+    <w:p/>
+    <w:p/>
+    <w:p/>
+    <w:p/>
+    <w:p/>
+    <w:p/>
+    <w:p/>
+    <w:p/>
+    <w:p/>
+    <w:p/>
+    <w:p>
+      <w:pPr>
+        <w:pStyle w:val="Ttulo1"/>
+      </w:pPr>
+    </w:p>
+    <w:p>
+      <w:pPr>
+        <w:pStyle w:val="Ttulo1"/>
+      </w:pPr>
       <w:r>
         <w:t>Índice:</w:t>
       </w:r>
@@ -376,66 +434,20 @@
         <w:t>Características principales</w:t>
       </w:r>
     </w:p>
-    <w:p>
-      <w:pPr>
-        <w:pStyle w:val="Prrafodelista"/>
-        <w:numPr>
-          <w:ilvl w:val="2"/>
-          <w:numId w:val="4"/>
-        </w:numPr>
-      </w:pPr>
-      <w:r>
-        <w:t>Funciones adicionales</w:t>
-      </w:r>
-    </w:p>
-    <w:p>
-      <w:pPr>
-        <w:pStyle w:val="Prrafodelista"/>
-        <w:numPr>
-          <w:ilvl w:val="1"/>
-          <w:numId w:val="4"/>
-        </w:numPr>
-      </w:pPr>
-      <w:r>
-        <w:t>Requisitos no funcionales</w:t>
-      </w:r>
-    </w:p>
-    <w:p>
-      <w:pPr>
-        <w:pStyle w:val="Prrafodelista"/>
-        <w:numPr>
-          <w:ilvl w:val="2"/>
-          <w:numId w:val="4"/>
-        </w:numPr>
-      </w:pPr>
-      <w:r>
-        <w:t>Requisitos de rendimiento</w:t>
-      </w:r>
-    </w:p>
-    <w:p>
-      <w:pPr>
-        <w:pStyle w:val="Prrafodelista"/>
-        <w:numPr>
-          <w:ilvl w:val="2"/>
-          <w:numId w:val="4"/>
-        </w:numPr>
-      </w:pPr>
-      <w:r>
-        <w:t>Requisitos de seguridad</w:t>
-      </w:r>
-    </w:p>
-    <w:p>
-      <w:pPr>
-        <w:pStyle w:val="Prrafodelista"/>
-        <w:numPr>
-          <w:ilvl w:val="2"/>
-          <w:numId w:val="4"/>
-        </w:numPr>
-      </w:pPr>
-      <w:r>
-        <w:t>Requisitos de usabilidad</w:t>
-      </w:r>
-    </w:p>
+    <w:p/>
+    <w:p/>
+    <w:p/>
+    <w:p/>
+    <w:p/>
+    <w:p/>
+    <w:p/>
+    <w:p/>
+    <w:p/>
+    <w:p/>
+    <w:p/>
+    <w:p/>
+    <w:p/>
+    <w:p/>
     <w:p>
       <w:pPr>
         <w:pStyle w:val="Ttulo1"/>
@@ -602,8 +614,16 @@
       <w:pPr>
         <w:pStyle w:val="Prrafodelista"/>
         <w:ind w:left="1080"/>
-      </w:pPr>
-      <w:r>
+        <w:rPr>
+          <w:sz w:val="24"/>
+          <w:szCs w:val="24"/>
+        </w:rPr>
+      </w:pPr>
+      <w:r>
+        <w:rPr>
+          <w:sz w:val="24"/>
+          <w:szCs w:val="24"/>
+        </w:rPr>
         <w:t>Los usuarios, dentro de la aplicación, deberán ser capaces de:</w:t>
       </w:r>
     </w:p>
@@ -614,8 +634,16 @@
           <w:ilvl w:val="1"/>
           <w:numId w:val="1"/>
         </w:numPr>
-      </w:pPr>
-      <w:r>
+        <w:rPr>
+          <w:sz w:val="24"/>
+          <w:szCs w:val="24"/>
+        </w:rPr>
+      </w:pPr>
+      <w:r>
+        <w:rPr>
+          <w:sz w:val="24"/>
+          <w:szCs w:val="24"/>
+        </w:rPr>
         <w:t>Crear cuentas: presentando cierta información vital (email, contraseña, etc.).</w:t>
       </w:r>
     </w:p>
@@ -626,8 +654,16 @@
           <w:ilvl w:val="1"/>
           <w:numId w:val="1"/>
         </w:numPr>
-      </w:pPr>
-      <w:r>
+        <w:rPr>
+          <w:sz w:val="24"/>
+          <w:szCs w:val="24"/>
+        </w:rPr>
+      </w:pPr>
+      <w:r>
+        <w:rPr>
+          <w:sz w:val="24"/>
+          <w:szCs w:val="24"/>
+        </w:rPr>
         <w:t>Editar cuentas: cambiar la información de una cuenta propia (email, contraseña, nombre de usuario, etc.)</w:t>
       </w:r>
     </w:p>
@@ -638,8 +674,16 @@
           <w:ilvl w:val="1"/>
           <w:numId w:val="1"/>
         </w:numPr>
-      </w:pPr>
-      <w:r>
+        <w:rPr>
+          <w:sz w:val="24"/>
+          <w:szCs w:val="24"/>
+        </w:rPr>
+      </w:pPr>
+      <w:r>
+        <w:rPr>
+          <w:sz w:val="24"/>
+          <w:szCs w:val="24"/>
+        </w:rPr>
         <w:t>Eliminar cuentas: inhabilitar una cuenta, impidiendo un futuro uso.</w:t>
       </w:r>
     </w:p>
@@ -650,8 +694,16 @@
           <w:ilvl w:val="1"/>
           <w:numId w:val="1"/>
         </w:numPr>
-      </w:pPr>
-      <w:r>
+        <w:rPr>
+          <w:sz w:val="24"/>
+          <w:szCs w:val="24"/>
+        </w:rPr>
+      </w:pPr>
+      <w:r>
+        <w:rPr>
+          <w:sz w:val="24"/>
+          <w:szCs w:val="24"/>
+        </w:rPr>
         <w:t>Denunciar cuentas: reportar usuarios por comportamientos ofensivos, u otra razón que amerite una sanción por parte de los administradores.</w:t>
       </w:r>
     </w:p>
@@ -662,8 +714,16 @@
           <w:ilvl w:val="1"/>
           <w:numId w:val="1"/>
         </w:numPr>
-      </w:pPr>
-      <w:r>
+        <w:rPr>
+          <w:sz w:val="24"/>
+          <w:szCs w:val="24"/>
+        </w:rPr>
+      </w:pPr>
+      <w:r>
+        <w:rPr>
+          <w:sz w:val="24"/>
+          <w:szCs w:val="24"/>
+        </w:rPr>
         <w:t>Bloquear cuentas: para impedir que se le recomiende contenido de estas cuentas, y que estas no puedan acceder a las publicaciones, comentarios, perfiles, etc., del usuario que los bloqueo.</w:t>
       </w:r>
     </w:p>
@@ -674,8 +734,16 @@
           <w:ilvl w:val="1"/>
           <w:numId w:val="1"/>
         </w:numPr>
-      </w:pPr>
-      <w:r>
+        <w:rPr>
+          <w:sz w:val="24"/>
+          <w:szCs w:val="24"/>
+        </w:rPr>
+      </w:pPr>
+      <w:r>
+        <w:rPr>
+          <w:sz w:val="24"/>
+          <w:szCs w:val="24"/>
+        </w:rPr>
         <w:t xml:space="preserve"> Seguir cuentas: para recibir una notificación cuando esta cuenta publique nuevo contenido, o para ser amigos y poder chatear si se siguen mutuamente.</w:t>
       </w:r>
     </w:p>
@@ -686,8 +754,16 @@
           <w:ilvl w:val="1"/>
           <w:numId w:val="1"/>
         </w:numPr>
-      </w:pPr>
-      <w:r>
+        <w:rPr>
+          <w:sz w:val="24"/>
+          <w:szCs w:val="24"/>
+        </w:rPr>
+      </w:pPr>
+      <w:r>
+        <w:rPr>
+          <w:sz w:val="24"/>
+          <w:szCs w:val="24"/>
+        </w:rPr>
         <w:t>Crear publicaciones: permitiendo expresar opiniones, compartir momentos, etc., con los otros usuarios.</w:t>
       </w:r>
     </w:p>
@@ -698,8 +774,16 @@
           <w:ilvl w:val="1"/>
           <w:numId w:val="1"/>
         </w:numPr>
-      </w:pPr>
-      <w:r>
+        <w:rPr>
+          <w:sz w:val="24"/>
+          <w:szCs w:val="24"/>
+        </w:rPr>
+      </w:pPr>
+      <w:r>
+        <w:rPr>
+          <w:sz w:val="24"/>
+          <w:szCs w:val="24"/>
+        </w:rPr>
         <w:t>Guardar publicaciones: para poder acceder posteriormente a estas desde un apartado de la aplicación.</w:t>
       </w:r>
     </w:p>
@@ -710,8 +794,16 @@
           <w:ilvl w:val="1"/>
           <w:numId w:val="1"/>
         </w:numPr>
-      </w:pPr>
-      <w:r>
+        <w:rPr>
+          <w:sz w:val="24"/>
+          <w:szCs w:val="24"/>
+        </w:rPr>
+      </w:pPr>
+      <w:r>
+        <w:rPr>
+          <w:sz w:val="24"/>
+          <w:szCs w:val="24"/>
+        </w:rPr>
         <w:t>Crear comentarios: permitiendo comentar en publicaciones o en otros comentarios.</w:t>
       </w:r>
     </w:p>
@@ -722,8 +814,16 @@
           <w:ilvl w:val="1"/>
           <w:numId w:val="1"/>
         </w:numPr>
-      </w:pPr>
-      <w:r>
+        <w:rPr>
+          <w:sz w:val="24"/>
+          <w:szCs w:val="24"/>
+        </w:rPr>
+      </w:pPr>
+      <w:r>
+        <w:rPr>
+          <w:sz w:val="24"/>
+          <w:szCs w:val="24"/>
+        </w:rPr>
         <w:t>Dar “me gusta”: a publicaciones o comentarios, demostrando tu apoyo hacia el autor.</w:t>
       </w:r>
     </w:p>
@@ -734,8 +834,16 @@
           <w:ilvl w:val="1"/>
           <w:numId w:val="1"/>
         </w:numPr>
-      </w:pPr>
-      <w:r>
+        <w:rPr>
+          <w:sz w:val="24"/>
+          <w:szCs w:val="24"/>
+        </w:rPr>
+      </w:pPr>
+      <w:r>
+        <w:rPr>
+          <w:sz w:val="24"/>
+          <w:szCs w:val="24"/>
+        </w:rPr>
         <w:t>Crear “chats”: permitiendo enviar mensajes directos a otros usuarios.</w:t>
       </w:r>
     </w:p>
@@ -750,75 +858,157 @@
     <w:p>
       <w:pPr>
         <w:pStyle w:val="Ttulo3"/>
+        <w:rPr>
+          <w:sz w:val="26"/>
+          <w:szCs w:val="26"/>
+        </w:rPr>
       </w:pPr>
       <w:r>
         <w:tab/>
+      </w:r>
+      <w:r>
+        <w:rPr>
+          <w:sz w:val="26"/>
+          <w:szCs w:val="26"/>
+        </w:rPr>
         <w:t>2.2.1 Interfases de usuario</w:t>
       </w:r>
     </w:p>
     <w:p>
-      <w:r>
+      <w:pPr>
+        <w:ind w:left="720" w:firstLine="709"/>
+        <w:rPr>
+          <w:sz w:val="24"/>
+          <w:szCs w:val="24"/>
+        </w:rPr>
+      </w:pPr>
+      <w:r>
+        <w:rPr>
+          <w:sz w:val="24"/>
+          <w:szCs w:val="24"/>
+        </w:rPr>
         <w:t>Como la idea central del proyecto es crear una red social que será utilizada por usuarios que no necesariamente tengan formación técnica, la interfaz debe ser sencilla para su entendimiento, permitiendo su fácil utilización y navegación por la misma.</w:t>
       </w:r>
     </w:p>
     <w:p>
-      <w:r>
+      <w:pPr>
+        <w:ind w:left="720" w:firstLine="709"/>
+        <w:rPr>
+          <w:sz w:val="24"/>
+          <w:szCs w:val="24"/>
+        </w:rPr>
+      </w:pPr>
+      <w:r>
+        <w:rPr>
+          <w:sz w:val="24"/>
+          <w:szCs w:val="24"/>
+        </w:rPr>
         <w:t xml:space="preserve">Esta interfaz, se planea, no debe tener una paleta de colores muy colorida ni estar cargada de botones, textos, o funciones y espacios innecesarios, para presentar un diseño moderno y minimalista. </w:t>
       </w:r>
     </w:p>
     <w:p>
-      <w:r>
+      <w:pPr>
+        <w:ind w:left="720" w:firstLine="709"/>
+        <w:rPr>
+          <w:sz w:val="24"/>
+          <w:szCs w:val="24"/>
+        </w:rPr>
+      </w:pPr>
+      <w:r>
+        <w:rPr>
+          <w:sz w:val="24"/>
+          <w:szCs w:val="24"/>
+        </w:rPr>
         <w:t>A su vez, se debe dar a la opción al usuario entre una paleta de colores clara y otra oscura, para que este elija su tema de color preferido.</w:t>
       </w:r>
     </w:p>
     <w:p>
-      <w:r>
+      <w:pPr>
+        <w:ind w:left="720" w:firstLine="709"/>
+        <w:rPr>
+          <w:sz w:val="24"/>
+          <w:szCs w:val="24"/>
+        </w:rPr>
+      </w:pPr>
+      <w:r>
+        <w:rPr>
+          <w:sz w:val="24"/>
+          <w:szCs w:val="24"/>
+        </w:rPr>
+        <w:lastRenderedPageBreak/>
         <w:t>Con respecto a las operaciones que realicen dentro de la aplicación, se deben restringir ciertas operaciones, para evitar que un usuario modifique el perfil, la actividad, o las publicaciones de otro usuario, por ejemplo.</w:t>
       </w:r>
     </w:p>
     <w:p>
       <w:pPr>
         <w:pStyle w:val="Ttulo3"/>
+        <w:rPr>
+          <w:sz w:val="26"/>
+          <w:szCs w:val="26"/>
+        </w:rPr>
       </w:pPr>
       <w:r>
         <w:tab/>
+      </w:r>
+      <w:r>
+        <w:rPr>
+          <w:sz w:val="26"/>
+          <w:szCs w:val="26"/>
+        </w:rPr>
         <w:t>2.2.2 Interfases de comunicación con el servidor</w:t>
       </w:r>
     </w:p>
     <w:p>
-      <w:r>
-        <w:t xml:space="preserve">El apartado de cliente de la aplicación, también llamado “frontend”, deberá comunicarse con el servidor, también llamado “backend”, el cual contendrá gran parte de la lógica necesaria para realizar funciones que afecten los datos dentro de las bases de datos. Se planea que estas </w:t>
-      </w:r>
-      <w:r>
-        <w:lastRenderedPageBreak/>
-        <w:t xml:space="preserve">comunicaciones se realicen mediante peticiones de tipo GraphQL a una API de este mismo tipo. </w:t>
+      <w:pPr>
+        <w:ind w:left="720" w:firstLine="709"/>
+        <w:rPr>
+          <w:sz w:val="24"/>
+          <w:szCs w:val="24"/>
+        </w:rPr>
+      </w:pPr>
+      <w:r>
+        <w:rPr>
+          <w:sz w:val="24"/>
+          <w:szCs w:val="24"/>
+        </w:rPr>
+        <w:t xml:space="preserve">El apartado de cliente de la aplicación, también llamado “frontend”, deberá comunicarse con el servidor, también llamado “backend”, el cual contendrá gran parte de la lógica necesaria para realizar funciones que afecten los datos dentro de las bases de datos. Se planea que estas comunicaciones se realicen mediante peticiones de tipo GraphQL a una API de este mismo tipo. </w:t>
       </w:r>
     </w:p>
     <w:p>
       <w:pPr>
         <w:pStyle w:val="Ttulo3"/>
+        <w:rPr>
+          <w:sz w:val="26"/>
+          <w:szCs w:val="26"/>
+        </w:rPr>
       </w:pPr>
       <w:r>
         <w:tab/>
+      </w:r>
+      <w:r>
+        <w:rPr>
+          <w:sz w:val="26"/>
+          <w:szCs w:val="26"/>
+        </w:rPr>
         <w:t>2.2.3 Interfases de comunicación con la base de datos</w:t>
       </w:r>
     </w:p>
     <w:p>
-      <w:r>
+      <w:pPr>
+        <w:ind w:left="720" w:firstLine="709"/>
+        <w:rPr>
+          <w:sz w:val="24"/>
+          <w:szCs w:val="24"/>
+        </w:rPr>
+      </w:pPr>
+      <w:r>
+        <w:rPr>
+          <w:sz w:val="24"/>
+          <w:szCs w:val="24"/>
+        </w:rPr>
         <w:t>El apartado “backend” en el servidor deberá poder comunicarse, consultar, editar y agregar registros o información en las bases de datos, permitiendo que los datos perduren entre sesiones, y que múltiples clientes puedan acceder a estos datos.</w:t>
       </w:r>
     </w:p>
-    <w:p/>
-    <w:p/>
-    <w:p/>
-    <w:p/>
-    <w:p/>
-    <w:p/>
-    <w:p/>
-    <w:p/>
-    <w:p/>
-    <w:p/>
-    <w:p/>
     <w:p/>
     <w:p/>
     <w:p/>
@@ -845,6 +1035,7 @@
         </w:numPr>
       </w:pPr>
       <w:r>
+        <w:lastRenderedPageBreak/>
         <w:t>CARACTERÍSTICAS Y REQUISITOS DEL SISTEMA</w:t>
       </w:r>
     </w:p>
@@ -857,6 +1048,9 @@
         </w:numPr>
       </w:pPr>
       <w:r>
+        <w:t xml:space="preserve"> </w:t>
+      </w:r>
+      <w:r>
         <w:t>Requisitos funcionales</w:t>
       </w:r>
     </w:p>
@@ -873,26 +1067,71 @@
       </w:r>
     </w:p>
     <w:p>
-      <w:r>
+      <w:pPr>
+        <w:ind w:left="720" w:firstLine="709"/>
+        <w:rPr>
+          <w:sz w:val="24"/>
+          <w:szCs w:val="24"/>
+        </w:rPr>
+      </w:pPr>
+      <w:r>
+        <w:rPr>
+          <w:sz w:val="24"/>
+          <w:szCs w:val="24"/>
+        </w:rPr>
         <w:t>La aplicación final deberá ser capaz de manejar las solicitudes de múltiples usuarios de forma simultánea, aunque a una cantidad reducida de estos debido a la escala del proyecto.</w:t>
       </w:r>
     </w:p>
     <w:p>
-      <w:r>
+      <w:pPr>
+        <w:ind w:left="720" w:firstLine="709"/>
+        <w:rPr>
+          <w:sz w:val="24"/>
+          <w:szCs w:val="24"/>
+        </w:rPr>
+      </w:pPr>
+      <w:r>
+        <w:rPr>
+          <w:sz w:val="24"/>
+          <w:szCs w:val="24"/>
+        </w:rPr>
         <w:t>La aplicación final deberá poder manejar a estos usuarios, almacenar su información, contestar a sus solicitudes y añadir o actualizar información en la base de datos según sea ordenado, ya sea por un usuario o por un</w:t>
       </w:r>
       <w:r>
+        <w:rPr>
+          <w:sz w:val="24"/>
+          <w:szCs w:val="24"/>
+        </w:rPr>
         <w:t xml:space="preserve"> administrador</w:t>
       </w:r>
       <w:r>
+        <w:rPr>
+          <w:sz w:val="24"/>
+          <w:szCs w:val="24"/>
+        </w:rPr>
         <w:t>.</w:t>
       </w:r>
     </w:p>
     <w:p>
-      <w:r>
+      <w:pPr>
+        <w:ind w:left="720" w:firstLine="709"/>
+        <w:rPr>
+          <w:sz w:val="24"/>
+          <w:szCs w:val="24"/>
+        </w:rPr>
+      </w:pPr>
+      <w:r>
+        <w:rPr>
+          <w:sz w:val="24"/>
+          <w:szCs w:val="24"/>
+        </w:rPr>
         <w:t>La aplicación deberá respetar los ajustes de preferencias establecidos por el usuario (privacidad, tema de color, usuarios bloqueados, etc.).</w:t>
       </w:r>
       <w:r>
+        <w:rPr>
+          <w:sz w:val="24"/>
+          <w:szCs w:val="24"/>
+        </w:rPr>
         <w:t xml:space="preserve"> </w:t>
       </w:r>
     </w:p>
@@ -909,12 +1148,34 @@
       </w:r>
     </w:p>
     <w:p>
-      <w:r>
+      <w:pPr>
+        <w:ind w:left="720" w:firstLine="709"/>
+        <w:rPr>
+          <w:sz w:val="24"/>
+          <w:szCs w:val="24"/>
+        </w:rPr>
+      </w:pPr>
+      <w:r>
+        <w:rPr>
+          <w:sz w:val="24"/>
+          <w:szCs w:val="24"/>
+        </w:rPr>
         <w:t>La aplicación final deberá soportar la utilización de múltiples canales de conversación de forma simultánea.</w:t>
       </w:r>
     </w:p>
     <w:p>
-      <w:r>
+      <w:pPr>
+        <w:ind w:left="720" w:firstLine="709"/>
+        <w:rPr>
+          <w:sz w:val="24"/>
+          <w:szCs w:val="24"/>
+        </w:rPr>
+      </w:pPr>
+      <w:r>
+        <w:rPr>
+          <w:sz w:val="24"/>
+          <w:szCs w:val="24"/>
+        </w:rPr>
         <w:t>La aplicación final deberá poder manejar estos chats, almacenar su información, agregar o editar registros de mensajes según petición de los usuarios que participen en estos; y emitir peticiones de actualización cuando detecten que hay nuevos registros en la base de datos (suscripción), lo que permitirá una comunicación en tiempo real entre los usuarios.</w:t>
       </w:r>
     </w:p>
@@ -931,10 +1192,25 @@
       </w:r>
     </w:p>
     <w:p>
-      <w:r>
+      <w:pPr>
+        <w:ind w:left="720" w:firstLine="709"/>
+        <w:rPr>
+          <w:sz w:val="24"/>
+          <w:szCs w:val="24"/>
+        </w:rPr>
+      </w:pPr>
+      <w:r>
+        <w:rPr>
+          <w:sz w:val="24"/>
+          <w:szCs w:val="24"/>
+        </w:rPr>
         <w:t>La aplicación final deberá permitir que los usuarios creen publicaciones y comentarios, realizando operaciones que interactúen con la base de datos y permitan la creación, eliminación, edición, reporte, y la obtención de registros de publicaciones y comentarios</w:t>
       </w:r>
       <w:r>
+        <w:rPr>
+          <w:sz w:val="24"/>
+          <w:szCs w:val="24"/>
+        </w:rPr>
         <w:t xml:space="preserve"> a petición de los usuarios.</w:t>
       </w:r>
     </w:p>
@@ -951,7 +1227,18 @@
       </w:r>
     </w:p>
     <w:p>
-      <w:r>
+      <w:pPr>
+        <w:ind w:left="720" w:firstLine="709"/>
+        <w:rPr>
+          <w:sz w:val="24"/>
+          <w:szCs w:val="24"/>
+        </w:rPr>
+      </w:pPr>
+      <w:r>
+        <w:rPr>
+          <w:sz w:val="24"/>
+          <w:szCs w:val="24"/>
+        </w:rPr>
         <w:t>La información de los usuarios deberá ser manejada con cuidado, respetando las preferencias de visibilidad establecidas por cada usuario y los bloqueos entre usuarios. Además, la información deberá ser formateada para evitar la distribución de información sensible.</w:t>
       </w:r>
     </w:p>
@@ -968,7 +1255,18 @@
       </w:r>
     </w:p>
     <w:p>
-      <w:r>
+      <w:pPr>
+        <w:ind w:left="720" w:firstLine="709"/>
+        <w:rPr>
+          <w:sz w:val="24"/>
+          <w:szCs w:val="24"/>
+        </w:rPr>
+      </w:pPr>
+      <w:r>
+        <w:rPr>
+          <w:sz w:val="24"/>
+          <w:szCs w:val="24"/>
+        </w:rPr>
         <w:t>Los reportes realizados por un usuario hacia otro serán almacenados en la base de datos, donde serán evaluados por un administrador, que llegará a la conclusión de desestimar la denuncia, o aplicar sanciones a los acusados.</w:t>
       </w:r>
     </w:p>
@@ -985,14 +1283,608 @@
       </w:r>
     </w:p>
     <w:p>
-      <w:r>
+      <w:pPr>
+        <w:ind w:left="720" w:firstLine="709"/>
+        <w:rPr>
+          <w:sz w:val="24"/>
+          <w:szCs w:val="24"/>
+        </w:rPr>
+      </w:pPr>
+      <w:r>
+        <w:rPr>
+          <w:sz w:val="24"/>
+          <w:szCs w:val="24"/>
+        </w:rPr>
         <w:t xml:space="preserve">La aplicación deberá ser capaz de determinar, y limitar las acciones de los usuarios según permisos, evitando que estos accedan a la información de otros usuarios, y puedan editar o eliminar la misma de la base de datos. </w:t>
       </w:r>
     </w:p>
     <w:p>
-      <w:r>
+      <w:pPr>
+        <w:ind w:left="720" w:firstLine="709"/>
+        <w:rPr>
+          <w:sz w:val="24"/>
+          <w:szCs w:val="24"/>
+        </w:rPr>
+      </w:pPr>
+      <w:r>
+        <w:rPr>
+          <w:sz w:val="24"/>
+          <w:szCs w:val="24"/>
+        </w:rPr>
+        <w:lastRenderedPageBreak/>
         <w:t>Con esto mismo, deberá evitar que los usuarios puedan realizar operaciones de administrar por la aplicación, como acceder a los reportes, modificar la información de la base de datos de forma no autorizada, etc.</w:t>
       </w:r>
+    </w:p>
+    <w:p>
+      <w:pPr>
+        <w:ind w:left="720" w:firstLine="709"/>
+      </w:pPr>
+    </w:p>
+    <w:p>
+      <w:pPr>
+        <w:pStyle w:val="Ttulo2"/>
+        <w:numPr>
+          <w:ilvl w:val="1"/>
+          <w:numId w:val="17"/>
+        </w:numPr>
+      </w:pPr>
+      <w:r>
+        <w:t xml:space="preserve"> Características del sistema</w:t>
+      </w:r>
+    </w:p>
+    <w:p>
+      <w:pPr>
+        <w:pStyle w:val="Ttulo3"/>
+        <w:numPr>
+          <w:ilvl w:val="2"/>
+          <w:numId w:val="17"/>
+        </w:numPr>
+        <w:rPr>
+          <w:sz w:val="26"/>
+          <w:szCs w:val="26"/>
+        </w:rPr>
+      </w:pPr>
+      <w:r>
+        <w:rPr>
+          <w:sz w:val="26"/>
+          <w:szCs w:val="26"/>
+        </w:rPr>
+        <w:t>Características principales</w:t>
+      </w:r>
+    </w:p>
+    <w:p>
+      <w:pPr>
+        <w:ind w:left="720" w:firstLine="709"/>
+        <w:rPr>
+          <w:sz w:val="24"/>
+          <w:szCs w:val="24"/>
+        </w:rPr>
+      </w:pPr>
+      <w:r>
+        <w:rPr>
+          <w:sz w:val="24"/>
+          <w:szCs w:val="24"/>
+        </w:rPr>
+        <w:t>La aplicación será planificada usando las siguientes herramientas:</w:t>
+      </w:r>
+    </w:p>
+    <w:p>
+      <w:pPr>
+        <w:pStyle w:val="Prrafodelista"/>
+        <w:numPr>
+          <w:ilvl w:val="0"/>
+          <w:numId w:val="1"/>
+        </w:numPr>
+        <w:rPr>
+          <w:sz w:val="24"/>
+          <w:szCs w:val="24"/>
+        </w:rPr>
+      </w:pPr>
+      <w:r>
+        <w:rPr>
+          <w:b/>
+          <w:bCs/>
+          <w:i/>
+          <w:iCs/>
+          <w:sz w:val="24"/>
+          <w:szCs w:val="24"/>
+          <w:u w:val="single"/>
+        </w:rPr>
+        <w:t>DBDiagram.io:</w:t>
+      </w:r>
+      <w:r>
+        <w:rPr>
+          <w:sz w:val="24"/>
+          <w:szCs w:val="24"/>
+        </w:rPr>
+        <w:t xml:space="preserve"> para crear esquemas del diseño de la base de datos.</w:t>
+      </w:r>
+    </w:p>
+    <w:p>
+      <w:pPr>
+        <w:pStyle w:val="Prrafodelista"/>
+        <w:numPr>
+          <w:ilvl w:val="0"/>
+          <w:numId w:val="1"/>
+        </w:numPr>
+        <w:rPr>
+          <w:sz w:val="24"/>
+          <w:szCs w:val="24"/>
+        </w:rPr>
+      </w:pPr>
+      <w:r>
+        <w:rPr>
+          <w:b/>
+          <w:bCs/>
+          <w:i/>
+          <w:iCs/>
+          <w:sz w:val="24"/>
+          <w:szCs w:val="24"/>
+          <w:u w:val="single"/>
+        </w:rPr>
+        <w:t>Eraser.io:</w:t>
+      </w:r>
+      <w:r>
+        <w:rPr>
+          <w:sz w:val="24"/>
+          <w:szCs w:val="24"/>
+        </w:rPr>
+        <w:t xml:space="preserve"> para crear esquemas de diseño del apartado del servidor (backend).</w:t>
+      </w:r>
+    </w:p>
+    <w:p>
+      <w:pPr>
+        <w:pStyle w:val="Prrafodelista"/>
+        <w:numPr>
+          <w:ilvl w:val="0"/>
+          <w:numId w:val="1"/>
+        </w:numPr>
+        <w:rPr>
+          <w:sz w:val="24"/>
+          <w:szCs w:val="24"/>
+        </w:rPr>
+      </w:pPr>
+      <w:r>
+        <w:rPr>
+          <w:b/>
+          <w:bCs/>
+          <w:i/>
+          <w:iCs/>
+          <w:sz w:val="24"/>
+          <w:szCs w:val="24"/>
+          <w:u w:val="single"/>
+        </w:rPr>
+        <w:t>Figma:</w:t>
+      </w:r>
+      <w:r>
+        <w:rPr>
+          <w:sz w:val="24"/>
+          <w:szCs w:val="24"/>
+        </w:rPr>
+        <w:t xml:space="preserve"> para crear diseños –a modo de prototipos— del aspecto visual de la aplicación (frontend).</w:t>
+      </w:r>
+    </w:p>
+    <w:p>
+      <w:pPr>
+        <w:ind w:left="720" w:firstLine="709"/>
+        <w:rPr>
+          <w:sz w:val="24"/>
+          <w:szCs w:val="24"/>
+        </w:rPr>
+      </w:pPr>
+      <w:r>
+        <w:rPr>
+          <w:sz w:val="24"/>
+          <w:szCs w:val="24"/>
+        </w:rPr>
+        <w:t>La aplicación será creada utilizando el siguiente stack tecnológico:</w:t>
+      </w:r>
+    </w:p>
+    <w:p>
+      <w:pPr>
+        <w:pStyle w:val="Prrafodelista"/>
+        <w:numPr>
+          <w:ilvl w:val="0"/>
+          <w:numId w:val="20"/>
+        </w:numPr>
+        <w:rPr>
+          <w:sz w:val="24"/>
+          <w:szCs w:val="24"/>
+        </w:rPr>
+      </w:pPr>
+      <w:r>
+        <w:rPr>
+          <w:b/>
+          <w:bCs/>
+          <w:i/>
+          <w:iCs/>
+          <w:sz w:val="24"/>
+          <w:szCs w:val="24"/>
+          <w:u w:val="single"/>
+        </w:rPr>
+        <w:t>TypeScript:</w:t>
+      </w:r>
+      <w:r>
+        <w:rPr>
+          <w:sz w:val="24"/>
+          <w:szCs w:val="24"/>
+        </w:rPr>
+        <w:t xml:space="preserve"> como lenguaje principal de programación para la lógica del backend y del frontend.</w:t>
+      </w:r>
+    </w:p>
+    <w:p>
+      <w:pPr>
+        <w:pStyle w:val="Prrafodelista"/>
+        <w:numPr>
+          <w:ilvl w:val="0"/>
+          <w:numId w:val="20"/>
+        </w:numPr>
+        <w:rPr>
+          <w:sz w:val="24"/>
+          <w:szCs w:val="24"/>
+        </w:rPr>
+      </w:pPr>
+      <w:r>
+        <w:rPr>
+          <w:b/>
+          <w:bCs/>
+          <w:i/>
+          <w:iCs/>
+          <w:sz w:val="24"/>
+          <w:szCs w:val="24"/>
+          <w:u w:val="single"/>
+        </w:rPr>
+        <w:t>React:</w:t>
+      </w:r>
+      <w:r>
+        <w:rPr>
+          <w:sz w:val="24"/>
+          <w:szCs w:val="24"/>
+        </w:rPr>
+        <w:t xml:space="preserve"> como marco de trabajo para la creación de componentes y vistas de las páginas del frontend.</w:t>
+      </w:r>
+    </w:p>
+    <w:p>
+      <w:pPr>
+        <w:pStyle w:val="Prrafodelista"/>
+        <w:numPr>
+          <w:ilvl w:val="0"/>
+          <w:numId w:val="20"/>
+        </w:numPr>
+        <w:rPr>
+          <w:sz w:val="24"/>
+          <w:szCs w:val="24"/>
+        </w:rPr>
+      </w:pPr>
+      <w:r>
+        <w:rPr>
+          <w:b/>
+          <w:bCs/>
+          <w:i/>
+          <w:iCs/>
+          <w:sz w:val="24"/>
+          <w:szCs w:val="24"/>
+          <w:u w:val="single"/>
+        </w:rPr>
+        <w:t>Node.js:</w:t>
+      </w:r>
+      <w:r>
+        <w:rPr>
+          <w:sz w:val="24"/>
+          <w:szCs w:val="24"/>
+        </w:rPr>
+        <w:t xml:space="preserve"> para crear el entorno de ejecución del servidor o backend.</w:t>
+      </w:r>
+    </w:p>
+    <w:p>
+      <w:pPr>
+        <w:pStyle w:val="Prrafodelista"/>
+        <w:numPr>
+          <w:ilvl w:val="0"/>
+          <w:numId w:val="20"/>
+        </w:numPr>
+        <w:rPr>
+          <w:sz w:val="24"/>
+          <w:szCs w:val="24"/>
+        </w:rPr>
+      </w:pPr>
+      <w:r>
+        <w:rPr>
+          <w:b/>
+          <w:bCs/>
+          <w:i/>
+          <w:iCs/>
+          <w:sz w:val="24"/>
+          <w:szCs w:val="24"/>
+          <w:u w:val="single"/>
+        </w:rPr>
+        <w:t>PostgreSQL:</w:t>
+      </w:r>
+      <w:r>
+        <w:rPr>
+          <w:sz w:val="24"/>
+          <w:szCs w:val="24"/>
+        </w:rPr>
+        <w:t xml:space="preserve"> para la creación y ejecución de las bases de datos que se irán a utilizar.</w:t>
+      </w:r>
+    </w:p>
+    <w:p>
+      <w:pPr>
+        <w:pStyle w:val="Prrafodelista"/>
+        <w:numPr>
+          <w:ilvl w:val="0"/>
+          <w:numId w:val="20"/>
+        </w:numPr>
+        <w:rPr>
+          <w:sz w:val="24"/>
+          <w:szCs w:val="24"/>
+        </w:rPr>
+      </w:pPr>
+      <w:r>
+        <w:rPr>
+          <w:b/>
+          <w:bCs/>
+          <w:i/>
+          <w:iCs/>
+          <w:sz w:val="24"/>
+          <w:szCs w:val="24"/>
+          <w:u w:val="single"/>
+        </w:rPr>
+        <w:t>ApolloServer/Client:</w:t>
+      </w:r>
+      <w:r>
+        <w:rPr>
+          <w:sz w:val="24"/>
+          <w:szCs w:val="24"/>
+        </w:rPr>
+        <w:t xml:space="preserve"> permitiendo la integración de GraphQL para el manejo de datos, consultas y suscripciones al servidor.</w:t>
+      </w:r>
+    </w:p>
+    <w:p>
+      <w:pPr>
+        <w:pStyle w:val="Prrafodelista"/>
+        <w:numPr>
+          <w:ilvl w:val="0"/>
+          <w:numId w:val="20"/>
+        </w:numPr>
+        <w:rPr>
+          <w:sz w:val="24"/>
+          <w:szCs w:val="24"/>
+        </w:rPr>
+      </w:pPr>
+      <w:r>
+        <w:rPr>
+          <w:b/>
+          <w:bCs/>
+          <w:i/>
+          <w:iCs/>
+          <w:sz w:val="24"/>
+          <w:szCs w:val="24"/>
+          <w:u w:val="single"/>
+        </w:rPr>
+        <w:t>Docker:</w:t>
+      </w:r>
+      <w:r>
+        <w:rPr>
+          <w:sz w:val="24"/>
+          <w:szCs w:val="24"/>
+        </w:rPr>
+        <w:t xml:space="preserve"> para crear contenedores donde se ejecutará la aplicación, manteniendo siempre las mismas características de ambiente.</w:t>
+      </w:r>
+    </w:p>
+    <w:p>
+      <w:pPr>
+        <w:pStyle w:val="Prrafodelista"/>
+        <w:numPr>
+          <w:ilvl w:val="0"/>
+          <w:numId w:val="20"/>
+        </w:numPr>
+        <w:rPr>
+          <w:sz w:val="24"/>
+          <w:szCs w:val="24"/>
+        </w:rPr>
+      </w:pPr>
+      <w:r>
+        <w:rPr>
+          <w:b/>
+          <w:bCs/>
+          <w:i/>
+          <w:iCs/>
+          <w:sz w:val="24"/>
+          <w:szCs w:val="24"/>
+          <w:u w:val="single"/>
+        </w:rPr>
+        <w:t>Visual Studio Code:</w:t>
+      </w:r>
+      <w:r>
+        <w:rPr>
+          <w:sz w:val="24"/>
+          <w:szCs w:val="24"/>
+        </w:rPr>
+        <w:t xml:space="preserve"> como editor de código principal.</w:t>
+      </w:r>
+    </w:p>
+    <w:p>
+      <w:pPr>
+        <w:ind w:left="720" w:firstLine="709"/>
+        <w:rPr>
+          <w:sz w:val="24"/>
+          <w:szCs w:val="24"/>
+        </w:rPr>
+      </w:pPr>
+      <w:r>
+        <w:rPr>
+          <w:sz w:val="24"/>
+          <w:szCs w:val="24"/>
+        </w:rPr>
+        <w:t>La aplicación será documentada usando:</w:t>
+      </w:r>
+    </w:p>
+    <w:p>
+      <w:pPr>
+        <w:pStyle w:val="Prrafodelista"/>
+        <w:numPr>
+          <w:ilvl w:val="0"/>
+          <w:numId w:val="21"/>
+        </w:numPr>
+        <w:rPr>
+          <w:sz w:val="24"/>
+          <w:szCs w:val="24"/>
+        </w:rPr>
+      </w:pPr>
+      <w:r>
+        <w:rPr>
+          <w:b/>
+          <w:bCs/>
+          <w:i/>
+          <w:iCs/>
+          <w:sz w:val="24"/>
+          <w:szCs w:val="24"/>
+          <w:u w:val="single"/>
+        </w:rPr>
+        <w:t>Git:</w:t>
+      </w:r>
+      <w:r>
+        <w:rPr>
+          <w:sz w:val="24"/>
+          <w:szCs w:val="24"/>
+        </w:rPr>
+        <w:t xml:space="preserve"> para el manejo de versiones del repositorio central.</w:t>
+      </w:r>
+    </w:p>
+    <w:p>
+      <w:pPr>
+        <w:pStyle w:val="Prrafodelista"/>
+        <w:numPr>
+          <w:ilvl w:val="0"/>
+          <w:numId w:val="21"/>
+        </w:numPr>
+        <w:rPr>
+          <w:sz w:val="24"/>
+          <w:szCs w:val="24"/>
+        </w:rPr>
+      </w:pPr>
+      <w:r>
+        <w:rPr>
+          <w:b/>
+          <w:bCs/>
+          <w:i/>
+          <w:iCs/>
+          <w:sz w:val="24"/>
+          <w:szCs w:val="24"/>
+          <w:u w:val="single"/>
+        </w:rPr>
+        <w:t>GitHub:</w:t>
+      </w:r>
+      <w:r>
+        <w:rPr>
+          <w:sz w:val="24"/>
+          <w:szCs w:val="24"/>
+        </w:rPr>
+        <w:t xml:space="preserve"> para almacenar el repositorio, con sus distintas versiones.</w:t>
+      </w:r>
+    </w:p>
+    <w:p>
+      <w:pPr>
+        <w:pStyle w:val="Prrafodelista"/>
+        <w:numPr>
+          <w:ilvl w:val="0"/>
+          <w:numId w:val="21"/>
+        </w:numPr>
+        <w:rPr>
+          <w:sz w:val="24"/>
+          <w:szCs w:val="24"/>
+        </w:rPr>
+      </w:pPr>
+      <w:r>
+        <w:rPr>
+          <w:b/>
+          <w:bCs/>
+          <w:i/>
+          <w:iCs/>
+          <w:sz w:val="24"/>
+          <w:szCs w:val="24"/>
+          <w:u w:val="single"/>
+        </w:rPr>
+        <w:t>Este documento:</w:t>
+      </w:r>
+      <w:r>
+        <w:rPr>
+          <w:sz w:val="24"/>
+          <w:szCs w:val="24"/>
+        </w:rPr>
+        <w:t xml:space="preserve"> para definir formalmente las necesidades y utilidades del proyecto entero.</w:t>
+      </w:r>
+    </w:p>
+    <w:p>
+      <w:pPr>
+        <w:pStyle w:val="Prrafodelista"/>
+        <w:numPr>
+          <w:ilvl w:val="0"/>
+          <w:numId w:val="21"/>
+        </w:numPr>
+        <w:rPr>
+          <w:sz w:val="24"/>
+          <w:szCs w:val="24"/>
+        </w:rPr>
+      </w:pPr>
+      <w:r>
+        <w:rPr>
+          <w:b/>
+          <w:bCs/>
+          <w:i/>
+          <w:iCs/>
+          <w:sz w:val="24"/>
+          <w:szCs w:val="24"/>
+          <w:u w:val="single"/>
+        </w:rPr>
+        <w:t>README.md:</w:t>
+      </w:r>
+      <w:r>
+        <w:rPr>
+          <w:sz w:val="24"/>
+          <w:szCs w:val="24"/>
+        </w:rPr>
+        <w:t xml:space="preserve"> dentro del repositorio, para dar una introducción al proyecto.</w:t>
+      </w:r>
+    </w:p>
+    <w:p>
+      <w:pPr>
+        <w:pStyle w:val="Prrafodelista"/>
+        <w:numPr>
+          <w:ilvl w:val="0"/>
+          <w:numId w:val="21"/>
+        </w:numPr>
+        <w:rPr>
+          <w:b/>
+          <w:bCs/>
+          <w:i/>
+          <w:iCs/>
+          <w:sz w:val="24"/>
+          <w:szCs w:val="24"/>
+          <w:u w:val="single"/>
+        </w:rPr>
+      </w:pPr>
+      <w:r>
+        <w:rPr>
+          <w:b/>
+          <w:bCs/>
+          <w:i/>
+          <w:iCs/>
+          <w:sz w:val="24"/>
+          <w:szCs w:val="24"/>
+          <w:u w:val="single"/>
+        </w:rPr>
+        <w:t>Swagger/Notion</w:t>
+      </w:r>
+    </w:p>
+    <w:p>
+      <w:pPr>
+        <w:rPr>
+          <w:sz w:val="24"/>
+          <w:szCs w:val="24"/>
+        </w:rPr>
+      </w:pPr>
     </w:p>
     <w:sectPr>
       <w:pgSz w:w="11906" w:h="16838"/>
@@ -1957,6 +2849,119 @@
     </w:lvl>
   </w:abstractNum>
   <w:abstractNum w:abstractNumId="9" w15:restartNumberingAfterBreak="0">
+    <w:nsid w:val="266778B1"/>
+    <w:multiLevelType w:val="hybridMultilevel"/>
+    <w:tmpl w:val="E9064E7E"/>
+    <w:lvl w:ilvl="0" w:tplc="580A0001">
+      <w:start w:val="1"/>
+      <w:numFmt w:val="bullet"/>
+      <w:lvlText w:val=""/>
+      <w:lvlJc w:val="left"/>
+      <w:pPr>
+        <w:ind w:left="720" w:hanging="360"/>
+      </w:pPr>
+      <w:rPr>
+        <w:rFonts w:ascii="Symbol" w:hAnsi="Symbol" w:hint="default"/>
+      </w:rPr>
+    </w:lvl>
+    <w:lvl w:ilvl="1" w:tplc="580A0003" w:tentative="1">
+      <w:start w:val="1"/>
+      <w:numFmt w:val="bullet"/>
+      <w:lvlText w:val="o"/>
+      <w:lvlJc w:val="left"/>
+      <w:pPr>
+        <w:ind w:left="1440" w:hanging="360"/>
+      </w:pPr>
+      <w:rPr>
+        <w:rFonts w:ascii="Courier New" w:hAnsi="Courier New" w:cs="Courier New" w:hint="default"/>
+      </w:rPr>
+    </w:lvl>
+    <w:lvl w:ilvl="2" w:tplc="580A0005" w:tentative="1">
+      <w:start w:val="1"/>
+      <w:numFmt w:val="bullet"/>
+      <w:lvlText w:val=""/>
+      <w:lvlJc w:val="left"/>
+      <w:pPr>
+        <w:ind w:left="2160" w:hanging="360"/>
+      </w:pPr>
+      <w:rPr>
+        <w:rFonts w:ascii="Wingdings" w:hAnsi="Wingdings" w:hint="default"/>
+      </w:rPr>
+    </w:lvl>
+    <w:lvl w:ilvl="3" w:tplc="580A0001" w:tentative="1">
+      <w:start w:val="1"/>
+      <w:numFmt w:val="bullet"/>
+      <w:lvlText w:val=""/>
+      <w:lvlJc w:val="left"/>
+      <w:pPr>
+        <w:ind w:left="2880" w:hanging="360"/>
+      </w:pPr>
+      <w:rPr>
+        <w:rFonts w:ascii="Symbol" w:hAnsi="Symbol" w:hint="default"/>
+      </w:rPr>
+    </w:lvl>
+    <w:lvl w:ilvl="4" w:tplc="580A0003" w:tentative="1">
+      <w:start w:val="1"/>
+      <w:numFmt w:val="bullet"/>
+      <w:lvlText w:val="o"/>
+      <w:lvlJc w:val="left"/>
+      <w:pPr>
+        <w:ind w:left="3600" w:hanging="360"/>
+      </w:pPr>
+      <w:rPr>
+        <w:rFonts w:ascii="Courier New" w:hAnsi="Courier New" w:cs="Courier New" w:hint="default"/>
+      </w:rPr>
+    </w:lvl>
+    <w:lvl w:ilvl="5" w:tplc="580A0005" w:tentative="1">
+      <w:start w:val="1"/>
+      <w:numFmt w:val="bullet"/>
+      <w:lvlText w:val=""/>
+      <w:lvlJc w:val="left"/>
+      <w:pPr>
+        <w:ind w:left="4320" w:hanging="360"/>
+      </w:pPr>
+      <w:rPr>
+        <w:rFonts w:ascii="Wingdings" w:hAnsi="Wingdings" w:hint="default"/>
+      </w:rPr>
+    </w:lvl>
+    <w:lvl w:ilvl="6" w:tplc="580A0001" w:tentative="1">
+      <w:start w:val="1"/>
+      <w:numFmt w:val="bullet"/>
+      <w:lvlText w:val=""/>
+      <w:lvlJc w:val="left"/>
+      <w:pPr>
+        <w:ind w:left="5040" w:hanging="360"/>
+      </w:pPr>
+      <w:rPr>
+        <w:rFonts w:ascii="Symbol" w:hAnsi="Symbol" w:hint="default"/>
+      </w:rPr>
+    </w:lvl>
+    <w:lvl w:ilvl="7" w:tplc="580A0003" w:tentative="1">
+      <w:start w:val="1"/>
+      <w:numFmt w:val="bullet"/>
+      <w:lvlText w:val="o"/>
+      <w:lvlJc w:val="left"/>
+      <w:pPr>
+        <w:ind w:left="5760" w:hanging="360"/>
+      </w:pPr>
+      <w:rPr>
+        <w:rFonts w:ascii="Courier New" w:hAnsi="Courier New" w:cs="Courier New" w:hint="default"/>
+      </w:rPr>
+    </w:lvl>
+    <w:lvl w:ilvl="8" w:tplc="580A0005" w:tentative="1">
+      <w:start w:val="1"/>
+      <w:numFmt w:val="bullet"/>
+      <w:lvlText w:val=""/>
+      <w:lvlJc w:val="left"/>
+      <w:pPr>
+        <w:ind w:left="6480" w:hanging="360"/>
+      </w:pPr>
+      <w:rPr>
+        <w:rFonts w:ascii="Wingdings" w:hAnsi="Wingdings" w:hint="default"/>
+      </w:rPr>
+    </w:lvl>
+  </w:abstractNum>
+  <w:abstractNum w:abstractNumId="10" w15:restartNumberingAfterBreak="0">
     <w:nsid w:val="29C47AD5"/>
     <w:multiLevelType w:val="multilevel"/>
     <w:tmpl w:val="6C7AF56A"/>
@@ -2074,7 +3079,120 @@
       </w:rPr>
     </w:lvl>
   </w:abstractNum>
-  <w:abstractNum w:abstractNumId="10" w15:restartNumberingAfterBreak="0">
+  <w:abstractNum w:abstractNumId="11" w15:restartNumberingAfterBreak="0">
+    <w:nsid w:val="2F29623D"/>
+    <w:multiLevelType w:val="hybridMultilevel"/>
+    <w:tmpl w:val="330E1EE0"/>
+    <w:lvl w:ilvl="0" w:tplc="580A0001">
+      <w:start w:val="1"/>
+      <w:numFmt w:val="bullet"/>
+      <w:lvlText w:val=""/>
+      <w:lvlJc w:val="left"/>
+      <w:pPr>
+        <w:ind w:left="720" w:hanging="360"/>
+      </w:pPr>
+      <w:rPr>
+        <w:rFonts w:ascii="Symbol" w:hAnsi="Symbol" w:hint="default"/>
+      </w:rPr>
+    </w:lvl>
+    <w:lvl w:ilvl="1" w:tplc="580A0003" w:tentative="1">
+      <w:start w:val="1"/>
+      <w:numFmt w:val="bullet"/>
+      <w:lvlText w:val="o"/>
+      <w:lvlJc w:val="left"/>
+      <w:pPr>
+        <w:ind w:left="1440" w:hanging="360"/>
+      </w:pPr>
+      <w:rPr>
+        <w:rFonts w:ascii="Courier New" w:hAnsi="Courier New" w:cs="Courier New" w:hint="default"/>
+      </w:rPr>
+    </w:lvl>
+    <w:lvl w:ilvl="2" w:tplc="580A0005" w:tentative="1">
+      <w:start w:val="1"/>
+      <w:numFmt w:val="bullet"/>
+      <w:lvlText w:val=""/>
+      <w:lvlJc w:val="left"/>
+      <w:pPr>
+        <w:ind w:left="2160" w:hanging="360"/>
+      </w:pPr>
+      <w:rPr>
+        <w:rFonts w:ascii="Wingdings" w:hAnsi="Wingdings" w:hint="default"/>
+      </w:rPr>
+    </w:lvl>
+    <w:lvl w:ilvl="3" w:tplc="580A0001" w:tentative="1">
+      <w:start w:val="1"/>
+      <w:numFmt w:val="bullet"/>
+      <w:lvlText w:val=""/>
+      <w:lvlJc w:val="left"/>
+      <w:pPr>
+        <w:ind w:left="2880" w:hanging="360"/>
+      </w:pPr>
+      <w:rPr>
+        <w:rFonts w:ascii="Symbol" w:hAnsi="Symbol" w:hint="default"/>
+      </w:rPr>
+    </w:lvl>
+    <w:lvl w:ilvl="4" w:tplc="580A0003" w:tentative="1">
+      <w:start w:val="1"/>
+      <w:numFmt w:val="bullet"/>
+      <w:lvlText w:val="o"/>
+      <w:lvlJc w:val="left"/>
+      <w:pPr>
+        <w:ind w:left="3600" w:hanging="360"/>
+      </w:pPr>
+      <w:rPr>
+        <w:rFonts w:ascii="Courier New" w:hAnsi="Courier New" w:cs="Courier New" w:hint="default"/>
+      </w:rPr>
+    </w:lvl>
+    <w:lvl w:ilvl="5" w:tplc="580A0005" w:tentative="1">
+      <w:start w:val="1"/>
+      <w:numFmt w:val="bullet"/>
+      <w:lvlText w:val=""/>
+      <w:lvlJc w:val="left"/>
+      <w:pPr>
+        <w:ind w:left="4320" w:hanging="360"/>
+      </w:pPr>
+      <w:rPr>
+        <w:rFonts w:ascii="Wingdings" w:hAnsi="Wingdings" w:hint="default"/>
+      </w:rPr>
+    </w:lvl>
+    <w:lvl w:ilvl="6" w:tplc="580A0001" w:tentative="1">
+      <w:start w:val="1"/>
+      <w:numFmt w:val="bullet"/>
+      <w:lvlText w:val=""/>
+      <w:lvlJc w:val="left"/>
+      <w:pPr>
+        <w:ind w:left="5040" w:hanging="360"/>
+      </w:pPr>
+      <w:rPr>
+        <w:rFonts w:ascii="Symbol" w:hAnsi="Symbol" w:hint="default"/>
+      </w:rPr>
+    </w:lvl>
+    <w:lvl w:ilvl="7" w:tplc="580A0003" w:tentative="1">
+      <w:start w:val="1"/>
+      <w:numFmt w:val="bullet"/>
+      <w:lvlText w:val="o"/>
+      <w:lvlJc w:val="left"/>
+      <w:pPr>
+        <w:ind w:left="5760" w:hanging="360"/>
+      </w:pPr>
+      <w:rPr>
+        <w:rFonts w:ascii="Courier New" w:hAnsi="Courier New" w:cs="Courier New" w:hint="default"/>
+      </w:rPr>
+    </w:lvl>
+    <w:lvl w:ilvl="8" w:tplc="580A0005" w:tentative="1">
+      <w:start w:val="1"/>
+      <w:numFmt w:val="bullet"/>
+      <w:lvlText w:val=""/>
+      <w:lvlJc w:val="left"/>
+      <w:pPr>
+        <w:ind w:left="6480" w:hanging="360"/>
+      </w:pPr>
+      <w:rPr>
+        <w:rFonts w:ascii="Wingdings" w:hAnsi="Wingdings" w:hint="default"/>
+      </w:rPr>
+    </w:lvl>
+  </w:abstractNum>
+  <w:abstractNum w:abstractNumId="12" w15:restartNumberingAfterBreak="0">
     <w:nsid w:val="34A02F1B"/>
     <w:multiLevelType w:val="multilevel"/>
     <w:tmpl w:val="93686754"/>
@@ -2223,7 +3341,7 @@
       </w:rPr>
     </w:lvl>
   </w:abstractNum>
-  <w:abstractNum w:abstractNumId="11" w15:restartNumberingAfterBreak="0">
+  <w:abstractNum w:abstractNumId="13" w15:restartNumberingAfterBreak="0">
     <w:nsid w:val="3F0203D8"/>
     <w:multiLevelType w:val="multilevel"/>
     <w:tmpl w:val="6C7AF56A"/>
@@ -2341,7 +3459,7 @@
       </w:rPr>
     </w:lvl>
   </w:abstractNum>
-  <w:abstractNum w:abstractNumId="12" w15:restartNumberingAfterBreak="0">
+  <w:abstractNum w:abstractNumId="14" w15:restartNumberingAfterBreak="0">
     <w:nsid w:val="3F4626A3"/>
     <w:multiLevelType w:val="multilevel"/>
     <w:tmpl w:val="D4ECFA40"/>
@@ -2490,7 +3608,7 @@
       </w:rPr>
     </w:lvl>
   </w:abstractNum>
-  <w:abstractNum w:abstractNumId="13" w15:restartNumberingAfterBreak="0">
+  <w:abstractNum w:abstractNumId="15" w15:restartNumberingAfterBreak="0">
     <w:nsid w:val="40374823"/>
     <w:multiLevelType w:val="hybridMultilevel"/>
     <w:tmpl w:val="5312431E"/>
@@ -2603,7 +3721,7 @@
       </w:rPr>
     </w:lvl>
   </w:abstractNum>
-  <w:abstractNum w:abstractNumId="14" w15:restartNumberingAfterBreak="0">
+  <w:abstractNum w:abstractNumId="16" w15:restartNumberingAfterBreak="0">
     <w:nsid w:val="4D515D1F"/>
     <w:multiLevelType w:val="multilevel"/>
     <w:tmpl w:val="6304143C"/>
@@ -2716,10 +3834,10 @@
       </w:pPr>
     </w:lvl>
   </w:abstractNum>
-  <w:abstractNum w:abstractNumId="15" w15:restartNumberingAfterBreak="0">
+  <w:abstractNum w:abstractNumId="17" w15:restartNumberingAfterBreak="0">
     <w:nsid w:val="62BD33D2"/>
     <w:multiLevelType w:val="hybridMultilevel"/>
-    <w:tmpl w:val="F70C4080"/>
+    <w:tmpl w:val="D79612D6"/>
     <w:lvl w:ilvl="0" w:tplc="580A0001">
       <w:start w:val="1"/>
       <w:numFmt w:val="bullet"/>
@@ -2829,7 +3947,7 @@
       </w:rPr>
     </w:lvl>
   </w:abstractNum>
-  <w:abstractNum w:abstractNumId="16" w15:restartNumberingAfterBreak="0">
+  <w:abstractNum w:abstractNumId="18" w15:restartNumberingAfterBreak="0">
     <w:nsid w:val="713C6C1D"/>
     <w:multiLevelType w:val="multilevel"/>
     <w:tmpl w:val="6C7AF56A"/>
@@ -2947,7 +4065,7 @@
       </w:rPr>
     </w:lvl>
   </w:abstractNum>
-  <w:abstractNum w:abstractNumId="17" w15:restartNumberingAfterBreak="0">
+  <w:abstractNum w:abstractNumId="19" w15:restartNumberingAfterBreak="0">
     <w:nsid w:val="71E10F84"/>
     <w:multiLevelType w:val="multilevel"/>
     <w:tmpl w:val="6C7AF56A"/>
@@ -3065,7 +4183,7 @@
       </w:rPr>
     </w:lvl>
   </w:abstractNum>
-  <w:abstractNum w:abstractNumId="18" w15:restartNumberingAfterBreak="0">
+  <w:abstractNum w:abstractNumId="20" w15:restartNumberingAfterBreak="0">
     <w:nsid w:val="7606263E"/>
     <w:multiLevelType w:val="hybridMultilevel"/>
     <w:tmpl w:val="AF2E0DA4"/>
@@ -3152,16 +4270,16 @@
     </w:lvl>
   </w:abstractNum>
   <w:num w:numId="1" w16cid:durableId="27949383">
-    <w:abstractNumId w:val="15"/>
+    <w:abstractNumId w:val="17"/>
   </w:num>
   <w:num w:numId="2" w16cid:durableId="1889415826">
-    <w:abstractNumId w:val="13"/>
+    <w:abstractNumId w:val="15"/>
   </w:num>
   <w:num w:numId="3" w16cid:durableId="1621642645">
     <w:abstractNumId w:val="5"/>
   </w:num>
   <w:num w:numId="4" w16cid:durableId="1668316139">
-    <w:abstractNumId w:val="11"/>
+    <w:abstractNumId w:val="13"/>
   </w:num>
   <w:num w:numId="5" w16cid:durableId="899905577">
     <w:abstractNumId w:val="7"/>
@@ -3176,19 +4294,19 @@
     <w:abstractNumId w:val="8"/>
   </w:num>
   <w:num w:numId="9" w16cid:durableId="331488046">
-    <w:abstractNumId w:val="18"/>
+    <w:abstractNumId w:val="20"/>
   </w:num>
   <w:num w:numId="10" w16cid:durableId="401752697">
-    <w:abstractNumId w:val="14"/>
+    <w:abstractNumId w:val="16"/>
   </w:num>
   <w:num w:numId="11" w16cid:durableId="1429740366">
-    <w:abstractNumId w:val="10"/>
+    <w:abstractNumId w:val="12"/>
   </w:num>
   <w:num w:numId="12" w16cid:durableId="596908851">
     <w:abstractNumId w:val="6"/>
   </w:num>
   <w:num w:numId="13" w16cid:durableId="880940116">
-    <w:abstractNumId w:val="12"/>
+    <w:abstractNumId w:val="14"/>
   </w:num>
   <w:num w:numId="14" w16cid:durableId="244072962">
     <w:abstractNumId w:val="0"/>
@@ -3200,13 +4318,19 @@
     <w:abstractNumId w:val="1"/>
   </w:num>
   <w:num w:numId="17" w16cid:durableId="1902789304">
-    <w:abstractNumId w:val="17"/>
+    <w:abstractNumId w:val="19"/>
   </w:num>
   <w:num w:numId="18" w16cid:durableId="222327637">
+    <w:abstractNumId w:val="10"/>
+  </w:num>
+  <w:num w:numId="19" w16cid:durableId="1664778228">
+    <w:abstractNumId w:val="18"/>
+  </w:num>
+  <w:num w:numId="20" w16cid:durableId="1994407930">
     <w:abstractNumId w:val="9"/>
   </w:num>
-  <w:num w:numId="19" w16cid:durableId="1664778228">
-    <w:abstractNumId w:val="16"/>
+  <w:num w:numId="21" w16cid:durableId="2092003293">
+    <w:abstractNumId w:val="11"/>
   </w:num>
 </w:numbering>
 </file>
@@ -3787,6 +4911,37 @@
       <w:szCs w:val="24"/>
     </w:rPr>
   </w:style>
+  <w:style w:type="paragraph" w:styleId="Subttulo">
+    <w:name w:val="Subtitle"/>
+    <w:basedOn w:val="Normal"/>
+    <w:next w:val="Normal"/>
+    <w:link w:val="SubttuloCar"/>
+    <w:uiPriority w:val="11"/>
+    <w:qFormat/>
+    <w:rsid w:val="00B670F4"/>
+    <w:pPr>
+      <w:numPr>
+        <w:ilvl w:val="1"/>
+      </w:numPr>
+    </w:pPr>
+    <w:rPr>
+      <w:rFonts w:eastAsiaTheme="minorEastAsia"/>
+      <w:color w:val="5A5A5A" w:themeColor="text1" w:themeTint="A5"/>
+      <w:spacing w:val="15"/>
+    </w:rPr>
+  </w:style>
+  <w:style w:type="character" w:customStyle="1" w:styleId="SubttuloCar">
+    <w:name w:val="Subtítulo Car"/>
+    <w:basedOn w:val="Fuentedeprrafopredeter"/>
+    <w:link w:val="Subttulo"/>
+    <w:uiPriority w:val="11"/>
+    <w:rsid w:val="00B670F4"/>
+    <w:rPr>
+      <w:rFonts w:eastAsiaTheme="minorEastAsia"/>
+      <w:color w:val="5A5A5A" w:themeColor="text1" w:themeTint="A5"/>
+      <w:spacing w:val="15"/>
+    </w:rPr>
+  </w:style>
 </w:styles>
 </file>
 

</xml_diff>

<commit_message>
Feat: GraphQL server initialization & tables from DB created ---Backend--- -Create backend folder -Install depedencies: @apollo/server, dotnev, graphql, pg, sequelizem ts-node-dev, @types/node, typescript -Add scripts: compile, dev, start -Add folders: database, graphql, modules, utils -Add index.ts which starts the graphql apollo server -Add utils/config.ts, which exports the environment vars from .env -Add graphql/resolvers.ts and graphql/typeDefs.ts, to define the typeDefs and resolvers for graphql -Add database/server.ts, which runs a connection test to the database
---SOURCE---
Add 16_7_2026_tables_creation.sql file at source path, which contains the whole sql query to create the tables Ill be using for now
</commit_message>
<xml_diff>
--- a/Documento de Especificación de Requisitos.docx
+++ b/Documento de Especificación de Requisitos.docx
@@ -1876,6 +1876,18 @@
           <w:u w:val="single"/>
         </w:rPr>
         <w:t>Swagger/Notion</w:t>
+      </w:r>
+      <w:r>
+        <w:rPr>
+          <w:b/>
+          <w:bCs/>
+          <w:i/>
+          <w:iCs/>
+          <w:sz w:val="24"/>
+          <w:szCs w:val="24"/>
+          <w:u w:val="single"/>
+        </w:rPr>
+        <w:t xml:space="preserve"> (¿?)</w:t>
       </w:r>
     </w:p>
     <w:p>

</xml_diff>